<commit_message>
cambios en reportes y paso de features a español, identificación comercios
</commit_message>
<xml_diff>
--- a/ruta/InformeFinal.docx
+++ b/ruta/InformeFinal.docx
@@ -1,26 +1,55 @@
 
 <file path=word/document.xml><?xml version="1.0" encoding="utf-8"?>
-<w:document xmlns:wpc="http://schemas.microsoft.com/office/word/2010/wordprocessingCanvas" xmlns:cx="http://schemas.microsoft.com/office/drawing/2014/chartex" xmlns:cx1="http://schemas.microsoft.com/office/drawing/2015/9/8/chartex" xmlns:cx2="http://schemas.microsoft.com/office/drawing/2015/10/21/chartex" xmlns:cx3="http://schemas.microsoft.com/office/drawing/2016/5/9/chartex" xmlns:cx4="http://schemas.microsoft.com/office/drawing/2016/5/10/chartex" xmlns:cx5="http://schemas.microsoft.com/office/drawing/2016/5/11/chartex" xmlns:cx6="http://schemas.microsoft.com/office/drawing/2016/5/12/chartex" xmlns:cx7="http://schemas.microsoft.com/office/drawing/2016/5/13/chartex" xmlns:cx8="http://schemas.microsoft.com/office/drawing/2016/5/14/chartex" xmlns:mc="http://schemas.openxmlformats.org/markup-compatibility/2006" xmlns:aink="http://schemas.microsoft.com/office/drawing/2016/ink" xmlns:am3d="http://schemas.microsoft.com/office/drawing/2017/model3d" xmlns:o="urn:schemas-microsoft-com:office:office" xmlns:oel="http://schemas.microsoft.com/office/2019/extlst" xmlns:r="http://schemas.openxmlformats.org/officeDocument/2006/relationships" xmlns:m="http://schemas.openxmlformats.org/officeDocument/2006/math" xmlns:v="urn:schemas-microsoft-com:vml" xmlns:wp14="http://schemas.microsoft.com/office/word/2010/wordprocessingDrawing" xmlns:wp="http://schemas.openxmlformats.org/drawingml/2006/wordprocessingDrawing" xmlns:w10="urn:schemas-microsoft-com:office:word" xmlns:w="http://schemas.openxmlformats.org/wordprocessingml/2006/main" xmlns:w14="http://schemas.microsoft.com/office/word/2010/wordml" xmlns:w15="http://schemas.microsoft.com/office/word/2012/wordml" xmlns:w16cex="http://schemas.microsoft.com/office/word/2018/wordml/cex" xmlns:w16cid="http://schemas.microsoft.com/office/word/2016/wordml/cid" xmlns:w16="http://schemas.microsoft.com/office/word/2018/wordml" xmlns:w16du="http://schemas.microsoft.com/office/word/2023/wordml/word16du" xmlns:w16sdtdh="http://schemas.microsoft.com/office/word/2020/wordml/sdtdatahash" xmlns:w16sdtfl="http://schemas.microsoft.com/office/word/2024/wordml/sdtformatlock" xmlns:w16se="http://schemas.microsoft.com/office/word/2015/wordml/symex" xmlns:wpg="http://schemas.microsoft.com/office/word/2010/wordprocessingGroup" xmlns:wpi="http://schemas.microsoft.com/office/word/2010/wordprocessingInk" xmlns:wne="http://schemas.microsoft.com/office/word/2006/wordml" xmlns:wps="http://schemas.microsoft.com/office/word/2010/wordprocessingShape" mc:Ignorable="w14 w15 w16se w16cid w16 w16cex w16sdtdh w16sdtfl w16du wp14">
+<w:document xmlns:o="urn:schemas-microsoft-com:office:office" xmlns:r="http://schemas.openxmlformats.org/officeDocument/2006/relationships" xmlns:v="urn:schemas-microsoft-com:vml" xmlns:w="http://schemas.openxmlformats.org/wordprocessingml/2006/main" xmlns:w10="urn:schemas-microsoft-com:office:word" xmlns:wp="http://schemas.openxmlformats.org/drawingml/2006/wordprocessingDrawing" xmlns:wps="http://schemas.microsoft.com/office/word/2010/wordprocessingShape" xmlns:wpg="http://schemas.microsoft.com/office/word/2010/wordprocessingGroup" xmlns:mc="http://schemas.openxmlformats.org/markup-compatibility/2006" xmlns:wp14="http://schemas.microsoft.com/office/word/2010/wordprocessingDrawing" xmlns:w14="http://schemas.microsoft.com/office/word/2010/wordml" xmlns:w15="http://schemas.microsoft.com/office/word/2012/wordml" mc:Ignorable="w14 wp14 w15">
   <w:body>
     <w:tbl>
       <w:tblPr>
         <w:tblStyle w:val="Tablaconcuadrcula"/>
-        <w:tblpPr w:leftFromText="141" w:rightFromText="141" w:vertAnchor="page" w:horzAnchor="margin" w:tblpY="2071"/>
+        <w:tblpPr w:bottomFromText="0" w:horzAnchor="margin" w:leftFromText="141" w:rightFromText="141" w:tblpX="0" w:tblpY="2071" w:topFromText="0" w:vertAnchor="page"/>
         <w:tblW w:w="9209" w:type="dxa"/>
-        <w:tblLook w:val="04A0" w:firstRow="1" w:lastRow="0" w:firstColumn="1" w:lastColumn="0" w:noHBand="0" w:noVBand="1"/>
+        <w:jc w:val="left"/>
+        <w:tblInd w:w="-5" w:type="dxa"/>
+        <w:tblLayout w:type="fixed"/>
+        <w:tblCellMar>
+          <w:top w:w="0" w:type="dxa"/>
+          <w:left w:w="108" w:type="dxa"/>
+          <w:bottom w:w="0" w:type="dxa"/>
+          <w:right w:w="108" w:type="dxa"/>
+        </w:tblCellMar>
+        <w:tblLook w:firstRow="1" w:noVBand="1" w:lastRow="0" w:firstColumn="1" w:lastColumn="0" w:noHBand="0" w:val="04a0"/>
       </w:tblPr>
       <w:tblGrid>
-        <w:gridCol w:w="2972"/>
+        <w:gridCol w:w="2971"/>
         <w:gridCol w:w="6237"/>
       </w:tblGrid>
       <w:tr>
+        <w:trPr/>
         <w:tc>
           <w:tcPr>
-            <w:tcW w:w="2972" w:type="dxa"/>
-            <w:shd w:val="clear" w:color="auto" w:fill="C00000"/>
+            <w:tcW w:w="2971" w:type="dxa"/>
+            <w:tcBorders/>
+            <w:shd w:color="auto" w:fill="C00000" w:val="clear"/>
           </w:tcPr>
           <w:p>
+            <w:pPr>
+              <w:pStyle w:val="Normal"/>
+              <w:widowControl/>
+              <w:spacing w:before="0" w:after="0"/>
+              <w:jc w:val="left"/>
+              <w:rPr>
+                <w:rFonts w:ascii="Aptos" w:hAnsi="Aptos" w:eastAsia="Aptos" w:cs=""/>
+                <w:sz w:val="22"/>
+                <w:szCs w:val="22"/>
+                <w:lang w:val="es-CO" w:eastAsia="en-US" w:bidi="ar-SA"/>
+              </w:rPr>
+            </w:pPr>
             <w:r>
+              <w:rPr>
+                <w:rFonts w:eastAsia="Aptos" w:cs=""/>
+                <w:sz w:val="22"/>
+                <w:szCs w:val="22"/>
+                <w:lang w:val="es-CO" w:eastAsia="en-US" w:bidi="ar-SA"/>
+              </w:rPr>
               <w:t>ESCEARIO PROBADO:</w:t>
             </w:r>
           </w:p>
@@ -28,22 +57,61 @@
         <w:tc>
           <w:tcPr>
             <w:tcW w:w="6237" w:type="dxa"/>
+            <w:tcBorders/>
           </w:tcPr>
           <w:p>
+            <w:pPr>
+              <w:pStyle w:val="Normal"/>
+              <w:widowControl/>
+              <w:spacing w:before="0" w:after="0"/>
+              <w:jc w:val="left"/>
+              <w:rPr>
+                <w:rFonts w:ascii="Aptos" w:hAnsi="Aptos" w:eastAsia="Aptos" w:cs=""/>
+                <w:sz w:val="22"/>
+                <w:szCs w:val="22"/>
+                <w:lang w:val="es-CO" w:eastAsia="en-US" w:bidi="ar-SA"/>
+              </w:rPr>
+            </w:pPr>
             <w:r>
+              <w:rPr>
+                <w:rFonts w:eastAsia="Aptos" w:cs=""/>
+                <w:sz w:val="22"/>
+                <w:szCs w:val="22"/>
+                <w:lang w:val="es-CO" w:eastAsia="en-US" w:bidi="ar-SA"/>
+              </w:rPr>
               <w:t>{{ESCENARIO}}</w:t>
             </w:r>
           </w:p>
         </w:tc>
       </w:tr>
       <w:tr>
+        <w:trPr/>
         <w:tc>
           <w:tcPr>
-            <w:tcW w:w="2972" w:type="dxa"/>
-            <w:shd w:val="clear" w:color="auto" w:fill="C00000"/>
+            <w:tcW w:w="2971" w:type="dxa"/>
+            <w:tcBorders/>
+            <w:shd w:color="auto" w:fill="C00000" w:val="clear"/>
           </w:tcPr>
           <w:p>
+            <w:pPr>
+              <w:pStyle w:val="Normal"/>
+              <w:widowControl/>
+              <w:spacing w:before="0" w:after="0"/>
+              <w:jc w:val="left"/>
+              <w:rPr>
+                <w:rFonts w:ascii="Aptos" w:hAnsi="Aptos" w:eastAsia="Aptos" w:cs=""/>
+                <w:sz w:val="22"/>
+                <w:szCs w:val="22"/>
+                <w:lang w:val="es-CO" w:eastAsia="en-US" w:bidi="ar-SA"/>
+              </w:rPr>
+            </w:pPr>
             <w:r>
+              <w:rPr>
+                <w:rFonts w:eastAsia="Aptos" w:cs=""/>
+                <w:sz w:val="22"/>
+                <w:szCs w:val="22"/>
+                <w:lang w:val="es-CO" w:eastAsia="en-US" w:bidi="ar-SA"/>
+              </w:rPr>
               <w:t>ID ESCENARIO</w:t>
             </w:r>
           </w:p>
@@ -51,26 +119,61 @@
         <w:tc>
           <w:tcPr>
             <w:tcW w:w="6237" w:type="dxa"/>
+            <w:tcBorders/>
           </w:tcPr>
           <w:p>
             <w:pPr>
+              <w:pStyle w:val="Normal"/>
+              <w:widowControl/>
+              <w:spacing w:before="0" w:after="0"/>
+              <w:jc w:val="left"/>
               <w:rPr>
                 <w:rFonts w:ascii="Calibri" w:hAnsi="Calibri" w:cs="Calibri"/>
                 <w:color w:val="000000"/>
                 <w:sz w:val="20"/>
               </w:rPr>
             </w:pPr>
+            <w:r>
+              <w:rPr>
+                <w:rFonts w:eastAsia="Aptos" w:cs="Calibri" w:ascii="Calibri" w:hAnsi="Calibri"/>
+                <w:color w:val="000000"/>
+                <w:sz w:val="22"/>
+                <w:szCs w:val="22"/>
+                <w:lang w:val="es-CO" w:eastAsia="en-US" w:bidi="ar-SA"/>
+              </w:rPr>
+              <w:t xml:space="preserve">{{ID}} </w:t>
+            </w:r>
           </w:p>
         </w:tc>
       </w:tr>
       <w:tr>
+        <w:trPr/>
         <w:tc>
           <w:tcPr>
-            <w:tcW w:w="2972" w:type="dxa"/>
-            <w:shd w:val="clear" w:color="auto" w:fill="C00000"/>
+            <w:tcW w:w="2971" w:type="dxa"/>
+            <w:tcBorders/>
+            <w:shd w:color="auto" w:fill="C00000" w:val="clear"/>
           </w:tcPr>
           <w:p>
+            <w:pPr>
+              <w:pStyle w:val="Normal"/>
+              <w:widowControl/>
+              <w:spacing w:before="0" w:after="0"/>
+              <w:jc w:val="left"/>
+              <w:rPr>
+                <w:rFonts w:ascii="Aptos" w:hAnsi="Aptos" w:eastAsia="Aptos" w:cs=""/>
+                <w:sz w:val="22"/>
+                <w:szCs w:val="22"/>
+                <w:lang w:val="es-CO" w:eastAsia="en-US" w:bidi="ar-SA"/>
+              </w:rPr>
+            </w:pPr>
             <w:r>
+              <w:rPr>
+                <w:rFonts w:eastAsia="Aptos" w:cs=""/>
+                <w:sz w:val="22"/>
+                <w:szCs w:val="22"/>
+                <w:lang w:val="es-CO" w:eastAsia="en-US" w:bidi="ar-SA"/>
+              </w:rPr>
               <w:t>FECHA DE PRUEBA:</w:t>
             </w:r>
           </w:p>
@@ -78,22 +181,61 @@
         <w:tc>
           <w:tcPr>
             <w:tcW w:w="6237" w:type="dxa"/>
+            <w:tcBorders/>
           </w:tcPr>
           <w:p>
+            <w:pPr>
+              <w:pStyle w:val="Normal"/>
+              <w:widowControl/>
+              <w:spacing w:before="0" w:after="0"/>
+              <w:jc w:val="left"/>
+              <w:rPr>
+                <w:rFonts w:ascii="Aptos" w:hAnsi="Aptos" w:eastAsia="Aptos" w:cs=""/>
+                <w:sz w:val="22"/>
+                <w:szCs w:val="22"/>
+                <w:lang w:val="es-CO" w:eastAsia="en-US" w:bidi="ar-SA"/>
+              </w:rPr>
+            </w:pPr>
             <w:r>
+              <w:rPr>
+                <w:rFonts w:eastAsia="Aptos" w:cs=""/>
+                <w:sz w:val="22"/>
+                <w:szCs w:val="22"/>
+                <w:lang w:val="es-CO" w:eastAsia="en-US" w:bidi="ar-SA"/>
+              </w:rPr>
               <w:t>{{FECHA}}</w:t>
             </w:r>
           </w:p>
         </w:tc>
       </w:tr>
       <w:tr>
+        <w:trPr/>
         <w:tc>
           <w:tcPr>
-            <w:tcW w:w="2972" w:type="dxa"/>
-            <w:shd w:val="clear" w:color="auto" w:fill="C00000"/>
+            <w:tcW w:w="2971" w:type="dxa"/>
+            <w:tcBorders/>
+            <w:shd w:color="auto" w:fill="C00000" w:val="clear"/>
           </w:tcPr>
           <w:p>
+            <w:pPr>
+              <w:pStyle w:val="Normal"/>
+              <w:widowControl/>
+              <w:spacing w:before="0" w:after="0"/>
+              <w:jc w:val="left"/>
+              <w:rPr>
+                <w:rFonts w:ascii="Aptos" w:hAnsi="Aptos" w:eastAsia="Aptos" w:cs=""/>
+                <w:sz w:val="22"/>
+                <w:szCs w:val="22"/>
+                <w:lang w:val="es-CO" w:eastAsia="en-US" w:bidi="ar-SA"/>
+              </w:rPr>
+            </w:pPr>
             <w:r>
+              <w:rPr>
+                <w:rFonts w:eastAsia="Aptos" w:cs=""/>
+                <w:sz w:val="22"/>
+                <w:szCs w:val="22"/>
+                <w:lang w:val="es-CO" w:eastAsia="en-US" w:bidi="ar-SA"/>
+              </w:rPr>
               <w:t xml:space="preserve">CONCLUSIÓN DE PRUEBAS </w:t>
             </w:r>
           </w:p>
@@ -101,9 +243,14 @@
         <w:tc>
           <w:tcPr>
             <w:tcW w:w="6237" w:type="dxa"/>
+            <w:tcBorders/>
           </w:tcPr>
           <w:p>
             <w:pPr>
+              <w:pStyle w:val="Normal"/>
+              <w:widowControl/>
+              <w:spacing w:before="0" w:after="0"/>
+              <w:jc w:val="left"/>
               <w:rPr>
                 <w:bCs/>
                 <w:u w:val="single"/>
@@ -111,7 +258,11 @@
             </w:pPr>
             <w:r>
               <w:rPr>
+                <w:rFonts w:eastAsia="Aptos" w:cs=""/>
                 <w:bCs/>
+                <w:sz w:val="22"/>
+                <w:szCs w:val="22"/>
+                <w:lang w:val="es-CO" w:eastAsia="en-US" w:bidi="ar-SA"/>
               </w:rPr>
               <w:t>{{CONCLUSION}}</w:t>
             </w:r>
@@ -119,16 +270,34 @@
         </w:tc>
       </w:tr>
       <w:tr>
+        <w:trPr/>
         <w:tc>
           <w:tcPr>
-            <w:tcW w:w="2972" w:type="dxa"/>
-            <w:shd w:val="clear" w:color="auto" w:fill="C00000"/>
+            <w:tcW w:w="2971" w:type="dxa"/>
+            <w:tcBorders/>
+            <w:shd w:color="auto" w:fill="C00000" w:val="clear"/>
           </w:tcPr>
           <w:p>
+            <w:pPr>
+              <w:pStyle w:val="Normal"/>
+              <w:widowControl/>
+              <w:spacing w:before="0" w:after="0"/>
+              <w:jc w:val="left"/>
+              <w:rPr>
+                <w:rFonts w:ascii="Aptos" w:hAnsi="Aptos" w:eastAsia="Aptos" w:cs=""/>
+                <w:sz w:val="22"/>
+                <w:szCs w:val="22"/>
+                <w:lang w:val="es-CO" w:eastAsia="en-US" w:bidi="ar-SA"/>
+              </w:rPr>
+            </w:pPr>
             <w:r>
+              <w:rPr>
+                <w:rFonts w:eastAsia="Aptos" w:cs=""/>
+                <w:sz w:val="22"/>
+                <w:szCs w:val="22"/>
+                <w:lang w:val="es-CO" w:eastAsia="en-US" w:bidi="ar-SA"/>
+              </w:rPr>
               <w:t xml:space="preserve">LINEA Y PLAN </w:t>
-            </w:r>
-            <w:r>
               <w:tab/>
             </w:r>
           </w:p>
@@ -136,9 +305,14 @@
         <w:tc>
           <w:tcPr>
             <w:tcW w:w="6237" w:type="dxa"/>
+            <w:tcBorders/>
           </w:tcPr>
           <w:p>
             <w:pPr>
+              <w:pStyle w:val="Normal"/>
+              <w:widowControl/>
+              <w:spacing w:before="0" w:after="0"/>
+              <w:jc w:val="left"/>
               <w:rPr>
                 <w:rFonts w:ascii="Calibri" w:hAnsi="Calibri" w:cs="Calibri"/>
                 <w:color w:val="000000"/>
@@ -146,8 +320,11 @@
             </w:pPr>
             <w:r>
               <w:rPr>
-                <w:rFonts w:ascii="Calibri" w:hAnsi="Calibri" w:cs="Calibri"/>
+                <w:rFonts w:eastAsia="Aptos" w:cs="Calibri" w:ascii="Calibri" w:hAnsi="Calibri"/>
                 <w:color w:val="000000"/>
+                <w:sz w:val="22"/>
+                <w:szCs w:val="22"/>
+                <w:lang w:val="es-CO" w:eastAsia="en-US" w:bidi="ar-SA"/>
               </w:rPr>
               <w:t>{{LINEA}}</w:t>
             </w:r>
@@ -155,13 +332,33 @@
         </w:tc>
       </w:tr>
       <w:tr>
+        <w:trPr/>
         <w:tc>
           <w:tcPr>
-            <w:tcW w:w="2972" w:type="dxa"/>
-            <w:shd w:val="clear" w:color="auto" w:fill="C00000"/>
+            <w:tcW w:w="2971" w:type="dxa"/>
+            <w:tcBorders/>
+            <w:shd w:color="auto" w:fill="C00000" w:val="clear"/>
           </w:tcPr>
           <w:p>
+            <w:pPr>
+              <w:pStyle w:val="Normal"/>
+              <w:widowControl/>
+              <w:spacing w:before="0" w:after="0"/>
+              <w:jc w:val="left"/>
+              <w:rPr>
+                <w:rFonts w:ascii="Aptos" w:hAnsi="Aptos" w:eastAsia="Aptos" w:cs=""/>
+                <w:sz w:val="22"/>
+                <w:szCs w:val="22"/>
+                <w:lang w:val="es-CO" w:eastAsia="en-US" w:bidi="ar-SA"/>
+              </w:rPr>
+            </w:pPr>
             <w:r>
+              <w:rPr>
+                <w:rFonts w:eastAsia="Aptos" w:cs=""/>
+                <w:sz w:val="22"/>
+                <w:szCs w:val="22"/>
+                <w:lang w:val="es-CO" w:eastAsia="en-US" w:bidi="ar-SA"/>
+              </w:rPr>
               <w:t>TIEMPO DE EJECUCIÓN:</w:t>
             </w:r>
           </w:p>
@@ -169,9 +366,14 @@
         <w:tc>
           <w:tcPr>
             <w:tcW w:w="6237" w:type="dxa"/>
+            <w:tcBorders/>
           </w:tcPr>
           <w:p>
             <w:pPr>
+              <w:pStyle w:val="Normal"/>
+              <w:widowControl/>
+              <w:spacing w:before="0" w:after="0"/>
+              <w:jc w:val="left"/>
               <w:rPr>
                 <w:rFonts w:ascii="Calibri" w:hAnsi="Calibri" w:cs="Calibri"/>
                 <w:color w:val="000000"/>
@@ -179,8 +381,11 @@
             </w:pPr>
             <w:r>
               <w:rPr>
-                <w:rFonts w:ascii="Calibri" w:hAnsi="Calibri" w:cs="Calibri"/>
+                <w:rFonts w:eastAsia="Aptos" w:cs="Calibri" w:ascii="Calibri" w:hAnsi="Calibri"/>
                 <w:color w:val="000000"/>
+                <w:sz w:val="22"/>
+                <w:szCs w:val="22"/>
+                <w:lang w:val="es-CO" w:eastAsia="en-US" w:bidi="ar-SA"/>
               </w:rPr>
               <w:t>{{DURACION}}</w:t>
             </w:r>
@@ -188,101 +393,91 @@
         </w:tc>
       </w:tr>
     </w:tbl>
-    <w:p/>
-    <w:p/>
-    <w:p/>
+    <w:p>
+      <w:pPr>
+        <w:pStyle w:val="Normal"/>
+        <w:rPr/>
+      </w:pPr>
+      <w:r>
+        <w:rPr/>
+      </w:r>
+    </w:p>
+    <w:p>
+      <w:pPr>
+        <w:pStyle w:val="Normal"/>
+        <w:rPr/>
+      </w:pPr>
+      <w:r>
+        <w:rPr/>
+      </w:r>
+    </w:p>
+    <w:p>
+      <w:pPr>
+        <w:pStyle w:val="Normal"/>
+        <w:rPr/>
+      </w:pPr>
+      <w:r>
+        <w:rPr/>
+      </w:r>
+    </w:p>
     <w:sectPr>
-      <w:headerReference w:type="default" r:id="rId6"/>
+      <w:headerReference w:type="default" r:id="rId2"/>
+      <w:type w:val="nextPage"/>
       <w:pgSz w:w="12240" w:h="15840"/>
-      <w:pgMar w:top="1417" w:right="1701" w:bottom="1417" w:left="1701" w:header="708" w:footer="708" w:gutter="0"/>
-      <w:cols w:space="708"/>
-      <w:docGrid w:linePitch="360"/>
+      <w:pgMar w:left="1701" w:right="1701" w:gutter="0" w:header="708" w:top="1417" w:footer="0" w:bottom="1417"/>
+      <w:pgNumType w:fmt="decimal"/>
+      <w:formProt w:val="false"/>
+      <w:textDirection w:val="lrTb"/>
+      <w:docGrid w:type="default" w:linePitch="360" w:charSpace="4096"/>
     </w:sectPr>
   </w:body>
 </w:document>
 </file>
 
-<file path=word/endnotes.xml><?xml version="1.0" encoding="utf-8"?>
-<w:endnotes xmlns:wpc="http://schemas.microsoft.com/office/word/2010/wordprocessingCanvas" xmlns:cx="http://schemas.microsoft.com/office/drawing/2014/chartex" xmlns:cx1="http://schemas.microsoft.com/office/drawing/2015/9/8/chartex" xmlns:cx2="http://schemas.microsoft.com/office/drawing/2015/10/21/chartex" xmlns:cx3="http://schemas.microsoft.com/office/drawing/2016/5/9/chartex" xmlns:cx4="http://schemas.microsoft.com/office/drawing/2016/5/10/chartex" xmlns:cx5="http://schemas.microsoft.com/office/drawing/2016/5/11/chartex" xmlns:cx6="http://schemas.microsoft.com/office/drawing/2016/5/12/chartex" xmlns:cx7="http://schemas.microsoft.com/office/drawing/2016/5/13/chartex" xmlns:cx8="http://schemas.microsoft.com/office/drawing/2016/5/14/chartex" xmlns:mc="http://schemas.openxmlformats.org/markup-compatibility/2006" xmlns:aink="http://schemas.microsoft.com/office/drawing/2016/ink" xmlns:am3d="http://schemas.microsoft.com/office/drawing/2017/model3d" xmlns:o="urn:schemas-microsoft-com:office:office" xmlns:oel="http://schemas.microsoft.com/office/2019/extlst" xmlns:r="http://schemas.openxmlformats.org/officeDocument/2006/relationships" xmlns:m="http://schemas.openxmlformats.org/officeDocument/2006/math" xmlns:v="urn:schemas-microsoft-com:vml" xmlns:wp14="http://schemas.microsoft.com/office/word/2010/wordprocessingDrawing" xmlns:wp="http://schemas.openxmlformats.org/drawingml/2006/wordprocessingDrawing" xmlns:w10="urn:schemas-microsoft-com:office:word" xmlns:w="http://schemas.openxmlformats.org/wordprocessingml/2006/main" xmlns:w14="http://schemas.microsoft.com/office/word/2010/wordml" xmlns:w15="http://schemas.microsoft.com/office/word/2012/wordml" xmlns:w16cex="http://schemas.microsoft.com/office/word/2018/wordml/cex" xmlns:w16cid="http://schemas.microsoft.com/office/word/2016/wordml/cid" xmlns:w16="http://schemas.microsoft.com/office/word/2018/wordml" xmlns:w16du="http://schemas.microsoft.com/office/word/2023/wordml/word16du" xmlns:w16sdtdh="http://schemas.microsoft.com/office/word/2020/wordml/sdtdatahash" xmlns:w16sdtfl="http://schemas.microsoft.com/office/word/2024/wordml/sdtformatlock" xmlns:w16se="http://schemas.microsoft.com/office/word/2015/wordml/symex" xmlns:wpg="http://schemas.microsoft.com/office/word/2010/wordprocessingGroup" xmlns:wpi="http://schemas.microsoft.com/office/word/2010/wordprocessingInk" xmlns:wne="http://schemas.microsoft.com/office/word/2006/wordml" xmlns:wps="http://schemas.microsoft.com/office/word/2010/wordprocessingShape" mc:Ignorable="w14 w15 w16se w16cid w16 w16cex w16sdtdh w16sdtfl w16du wp14">
-  <w:endnote w:type="separator" w:id="-1">
-    <w:p>
-      <w:r>
-        <w:separator/>
-      </w:r>
-    </w:p>
-  </w:endnote>
-  <w:endnote w:type="continuationSeparator" w:id="0">
-    <w:p>
-      <w:r>
-        <w:continuationSeparator/>
-      </w:r>
-    </w:p>
-  </w:endnote>
-</w:endnotes>
-</file>
-
-<file path=word/footnotes.xml><?xml version="1.0" encoding="utf-8"?>
-<w:footnotes xmlns:wpc="http://schemas.microsoft.com/office/word/2010/wordprocessingCanvas" xmlns:cx="http://schemas.microsoft.com/office/drawing/2014/chartex" xmlns:cx1="http://schemas.microsoft.com/office/drawing/2015/9/8/chartex" xmlns:cx2="http://schemas.microsoft.com/office/drawing/2015/10/21/chartex" xmlns:cx3="http://schemas.microsoft.com/office/drawing/2016/5/9/chartex" xmlns:cx4="http://schemas.microsoft.com/office/drawing/2016/5/10/chartex" xmlns:cx5="http://schemas.microsoft.com/office/drawing/2016/5/11/chartex" xmlns:cx6="http://schemas.microsoft.com/office/drawing/2016/5/12/chartex" xmlns:cx7="http://schemas.microsoft.com/office/drawing/2016/5/13/chartex" xmlns:cx8="http://schemas.microsoft.com/office/drawing/2016/5/14/chartex" xmlns:mc="http://schemas.openxmlformats.org/markup-compatibility/2006" xmlns:aink="http://schemas.microsoft.com/office/drawing/2016/ink" xmlns:am3d="http://schemas.microsoft.com/office/drawing/2017/model3d" xmlns:o="urn:schemas-microsoft-com:office:office" xmlns:oel="http://schemas.microsoft.com/office/2019/extlst" xmlns:r="http://schemas.openxmlformats.org/officeDocument/2006/relationships" xmlns:m="http://schemas.openxmlformats.org/officeDocument/2006/math" xmlns:v="urn:schemas-microsoft-com:vml" xmlns:wp14="http://schemas.microsoft.com/office/word/2010/wordprocessingDrawing" xmlns:wp="http://schemas.openxmlformats.org/drawingml/2006/wordprocessingDrawing" xmlns:w10="urn:schemas-microsoft-com:office:word" xmlns:w="http://schemas.openxmlformats.org/wordprocessingml/2006/main" xmlns:w14="http://schemas.microsoft.com/office/word/2010/wordml" xmlns:w15="http://schemas.microsoft.com/office/word/2012/wordml" xmlns:w16cex="http://schemas.microsoft.com/office/word/2018/wordml/cex" xmlns:w16cid="http://schemas.microsoft.com/office/word/2016/wordml/cid" xmlns:w16="http://schemas.microsoft.com/office/word/2018/wordml" xmlns:w16du="http://schemas.microsoft.com/office/word/2023/wordml/word16du" xmlns:w16sdtdh="http://schemas.microsoft.com/office/word/2020/wordml/sdtdatahash" xmlns:w16sdtfl="http://schemas.microsoft.com/office/word/2024/wordml/sdtformatlock" xmlns:w16se="http://schemas.microsoft.com/office/word/2015/wordml/symex" xmlns:wpg="http://schemas.microsoft.com/office/word/2010/wordprocessingGroup" xmlns:wpi="http://schemas.microsoft.com/office/word/2010/wordprocessingInk" xmlns:wne="http://schemas.microsoft.com/office/word/2006/wordml" xmlns:wps="http://schemas.microsoft.com/office/word/2010/wordprocessingShape" mc:Ignorable="w14 w15 w16se w16cid w16 w16cex w16sdtdh w16sdtfl w16du wp14">
-  <w:footnote w:type="separator" w:id="-1">
-    <w:p>
-      <w:r>
-        <w:separator/>
-      </w:r>
-    </w:p>
-  </w:footnote>
-  <w:footnote w:type="continuationSeparator" w:id="0">
-    <w:p>
-      <w:r>
-        <w:continuationSeparator/>
-      </w:r>
-    </w:p>
-  </w:footnote>
-</w:footnotes>
-</file>
-
 <file path=word/header1.xml><?xml version="1.0" encoding="utf-8"?>
-<w:hdr xmlns:wpc="http://schemas.microsoft.com/office/word/2010/wordprocessingCanvas" xmlns:cx="http://schemas.microsoft.com/office/drawing/2014/chartex" xmlns:cx1="http://schemas.microsoft.com/office/drawing/2015/9/8/chartex" xmlns:cx2="http://schemas.microsoft.com/office/drawing/2015/10/21/chartex" xmlns:cx3="http://schemas.microsoft.com/office/drawing/2016/5/9/chartex" xmlns:cx4="http://schemas.microsoft.com/office/drawing/2016/5/10/chartex" xmlns:cx5="http://schemas.microsoft.com/office/drawing/2016/5/11/chartex" xmlns:cx6="http://schemas.microsoft.com/office/drawing/2016/5/12/chartex" xmlns:cx7="http://schemas.microsoft.com/office/drawing/2016/5/13/chartex" xmlns:cx8="http://schemas.microsoft.com/office/drawing/2016/5/14/chartex" xmlns:mc="http://schemas.openxmlformats.org/markup-compatibility/2006" xmlns:aink="http://schemas.microsoft.com/office/drawing/2016/ink" xmlns:am3d="http://schemas.microsoft.com/office/drawing/2017/model3d" xmlns:o="urn:schemas-microsoft-com:office:office" xmlns:oel="http://schemas.microsoft.com/office/2019/extlst" xmlns:r="http://schemas.openxmlformats.org/officeDocument/2006/relationships" xmlns:m="http://schemas.openxmlformats.org/officeDocument/2006/math" xmlns:v="urn:schemas-microsoft-com:vml" xmlns:wp14="http://schemas.microsoft.com/office/word/2010/wordprocessingDrawing" xmlns:wp="http://schemas.openxmlformats.org/drawingml/2006/wordprocessingDrawing" xmlns:w10="urn:schemas-microsoft-com:office:word" xmlns:w="http://schemas.openxmlformats.org/wordprocessingml/2006/main" xmlns:w14="http://schemas.microsoft.com/office/word/2010/wordml" xmlns:w15="http://schemas.microsoft.com/office/word/2012/wordml" xmlns:w16cex="http://schemas.microsoft.com/office/word/2018/wordml/cex" xmlns:w16cid="http://schemas.microsoft.com/office/word/2016/wordml/cid" xmlns:w16="http://schemas.microsoft.com/office/word/2018/wordml" xmlns:w16du="http://schemas.microsoft.com/office/word/2023/wordml/word16du" xmlns:w16sdtdh="http://schemas.microsoft.com/office/word/2020/wordml/sdtdatahash" xmlns:w16sdtfl="http://schemas.microsoft.com/office/word/2024/wordml/sdtformatlock" xmlns:w16se="http://schemas.microsoft.com/office/word/2015/wordml/symex" xmlns:wpg="http://schemas.microsoft.com/office/word/2010/wordprocessingGroup" xmlns:wpi="http://schemas.microsoft.com/office/word/2010/wordprocessingInk" xmlns:wne="http://schemas.microsoft.com/office/word/2006/wordml" xmlns:wps="http://schemas.microsoft.com/office/word/2010/wordprocessingShape" mc:Ignorable="w14 w15 w16se w16cid w16 w16cex w16sdtdh w16sdtfl w16du wp14">
+<w:hdr xmlns:o="urn:schemas-microsoft-com:office:office" xmlns:r="http://schemas.openxmlformats.org/officeDocument/2006/relationships" xmlns:v="urn:schemas-microsoft-com:vml" xmlns:w="http://schemas.openxmlformats.org/wordprocessingml/2006/main" xmlns:w10="urn:schemas-microsoft-com:office:word" xmlns:wp="http://schemas.openxmlformats.org/drawingml/2006/wordprocessingDrawing" xmlns:wps="http://schemas.microsoft.com/office/word/2010/wordprocessingShape" xmlns:wpg="http://schemas.microsoft.com/office/word/2010/wordprocessingGroup" xmlns:mc="http://schemas.openxmlformats.org/markup-compatibility/2006" xmlns:wp14="http://schemas.microsoft.com/office/word/2010/wordprocessingDrawing" xmlns:w14="http://schemas.microsoft.com/office/word/2010/wordml" xmlns:w15="http://schemas.microsoft.com/office/word/2012/wordml" mc:Ignorable="w14 wp14 w15">
   <w:p>
     <w:pPr>
-      <w:pStyle w:val="Encabezado"/>
+      <w:pStyle w:val="Cabecera"/>
       <w:jc w:val="center"/>
-    </w:pPr>
+      <w:rPr/>
+    </w:pPr>
+    <w:r>
+      <w:rPr/>
+    </w:r>
   </w:p>
   <w:p>
     <w:pPr>
-      <w:pStyle w:val="Encabezado"/>
+      <w:pStyle w:val="Cabecera"/>
       <w:jc w:val="center"/>
+      <w:rPr/>
     </w:pPr>
     <w:r>
-      <w:rPr>
-        <w:noProof/>
-        <w:lang w:eastAsia="es-CO"/>
-      </w:rPr>
       <w:drawing>
-        <wp:anchor distT="0" distB="0" distL="114300" distR="114300" simplePos="0" relativeHeight="251659264" behindDoc="0" locked="0" layoutInCell="1" allowOverlap="1" wp14:anchorId="5D8CA18D" wp14:editId="771E8B51">
+        <wp:anchor behindDoc="0" distT="0" distB="0" distL="0" distR="114300" simplePos="0" locked="0" layoutInCell="0" allowOverlap="1" relativeHeight="2">
           <wp:simplePos x="0" y="0"/>
           <wp:positionH relativeFrom="margin">
             <wp:align>left</wp:align>
           </wp:positionH>
           <wp:positionV relativeFrom="paragraph">
-            <wp:posOffset>-172425</wp:posOffset>
+            <wp:posOffset>-172720</wp:posOffset>
           </wp:positionV>
-          <wp:extent cx="1217808" cy="457200"/>
-          <wp:effectExtent l="0" t="0" r="1905" b="0"/>
+          <wp:extent cx="1217930" cy="457200"/>
+          <wp:effectExtent l="0" t="0" r="0" b="0"/>
           <wp:wrapThrough wrapText="bothSides">
             <wp:wrapPolygon edited="0">
-              <wp:start x="14873" y="0"/>
-              <wp:lineTo x="0" y="6300"/>
-              <wp:lineTo x="0" y="18900"/>
-              <wp:lineTo x="676" y="20700"/>
-              <wp:lineTo x="17577" y="20700"/>
-              <wp:lineTo x="21296" y="16200"/>
-              <wp:lineTo x="21296" y="0"/>
-              <wp:lineTo x="17239" y="0"/>
-              <wp:lineTo x="14873" y="0"/>
+              <wp:start x="14867" y="0"/>
+              <wp:lineTo x="-9" y="6295"/>
+              <wp:lineTo x="-9" y="18886"/>
+              <wp:lineTo x="670" y="20694"/>
+              <wp:lineTo x="17570" y="20694"/>
+              <wp:lineTo x="21291" y="16190"/>
+              <wp:lineTo x="21291" y="0"/>
+              <wp:lineTo x="17231" y="0"/>
+              <wp:lineTo x="14867" y="0"/>
             </wp:wrapPolygon>
           </wp:wrapThrough>
-          <wp:docPr id="10" name="Imagen 10" descr="Logotipo  El contenido generado por IA puede ser incorrecto."/>
+          <wp:docPr id="1" name="Imagen 10" descr="Logotipo  El contenido generado por IA puede ser incorrecto."/>
           <wp:cNvGraphicFramePr>
             <a:graphicFrameLocks xmlns:a="http://schemas.openxmlformats.org/drawingml/2006/main" noChangeAspect="1"/>
           </wp:cNvGraphicFramePr>
@@ -290,25 +485,21 @@
             <a:graphicData uri="http://schemas.openxmlformats.org/drawingml/2006/picture">
               <pic:pic xmlns:pic="http://schemas.openxmlformats.org/drawingml/2006/picture">
                 <pic:nvPicPr>
-                  <pic:cNvPr id="10" name="Imagen 10" descr="Logotipo  El contenido generado por IA puede ser incorrecto."/>
-                  <pic:cNvPicPr/>
+                  <pic:cNvPr id="1" name="Imagen 10" descr="Logotipo  El contenido generado por IA puede ser incorrecto."/>
+                  <pic:cNvPicPr>
+                    <a:picLocks noChangeAspect="1" noChangeArrowheads="1"/>
+                  </pic:cNvPicPr>
                 </pic:nvPicPr>
                 <pic:blipFill>
-                  <a:blip r:embed="rId1" cstate="print">
-                    <a:extLst>
-                      <a:ext uri="{28A0092B-C50C-407E-A947-70E740481C1C}">
-                        <a14:useLocalDpi xmlns:a14="http://schemas.microsoft.com/office/drawing/2010/main" val="0"/>
-                      </a:ext>
-                    </a:extLst>
-                  </a:blip>
+                  <a:blip r:embed="rId1"/>
                   <a:stretch>
                     <a:fillRect/>
                   </a:stretch>
                 </pic:blipFill>
-                <pic:spPr>
+                <pic:spPr bwMode="auto">
                   <a:xfrm>
                     <a:off x="0" y="0"/>
-                    <a:ext cx="1217808" cy="457200"/>
+                    <a:ext cx="1217930" cy="457200"/>
                   </a:xfrm>
                   <a:prstGeom prst="rect">
                     <a:avLst/>
@@ -321,35 +512,43 @@
       </w:drawing>
     </w:r>
     <w:r>
+      <w:rPr/>
       <w:t>PRUEBAS EXPERIENCIA DE USUARIO</w:t>
     </w:r>
   </w:p>
   <w:p>
     <w:pPr>
-      <w:pStyle w:val="Encabezado"/>
+      <w:pStyle w:val="Cabecera"/>
       <w:jc w:val="center"/>
+      <w:rPr/>
     </w:pPr>
     <w:r>
+      <w:rPr/>
       <w:t>EXUS</w:t>
     </w:r>
   </w:p>
   <w:p>
     <w:pPr>
-      <w:pStyle w:val="Encabezado"/>
+      <w:pStyle w:val="Cabecera"/>
       <w:rPr>
         <w:lang w:val="es-ES"/>
       </w:rPr>
     </w:pPr>
+    <w:r>
+      <w:rPr>
+        <w:lang w:val="es-ES"/>
+      </w:rPr>
+    </w:r>
   </w:p>
 </w:hdr>
 </file>
 
 <file path=word/styles.xml><?xml version="1.0" encoding="utf-8"?>
-<w:styles xmlns:mc="http://schemas.openxmlformats.org/markup-compatibility/2006" xmlns:r="http://schemas.openxmlformats.org/officeDocument/2006/relationships" xmlns:w="http://schemas.openxmlformats.org/wordprocessingml/2006/main" xmlns:w14="http://schemas.microsoft.com/office/word/2010/wordml" xmlns:w15="http://schemas.microsoft.com/office/word/2012/wordml" xmlns:w16cex="http://schemas.microsoft.com/office/word/2018/wordml/cex" xmlns:w16cid="http://schemas.microsoft.com/office/word/2016/wordml/cid" xmlns:w16="http://schemas.microsoft.com/office/word/2018/wordml" xmlns:w16du="http://schemas.microsoft.com/office/word/2023/wordml/word16du" xmlns:w16sdtdh="http://schemas.microsoft.com/office/word/2020/wordml/sdtdatahash" xmlns:w16sdtfl="http://schemas.microsoft.com/office/word/2024/wordml/sdtformatlock" xmlns:w16se="http://schemas.microsoft.com/office/word/2015/wordml/symex" mc:Ignorable="w14 w15 w16se w16cid w16 w16cex w16sdtdh w16sdtfl w16du">
+<w:styles xmlns:w="http://schemas.openxmlformats.org/wordprocessingml/2006/main" xmlns:w14="http://schemas.microsoft.com/office/word/2010/wordml" xmlns:mc="http://schemas.openxmlformats.org/markup-compatibility/2006" mc:Ignorable="w14">
   <w:docDefaults>
     <w:rPrDefault>
       <w:rPr>
-        <w:rFonts w:asciiTheme="minorHAnsi" w:eastAsiaTheme="minorHAnsi" w:hAnsiTheme="minorHAnsi" w:cstheme="minorBidi"/>
+        <w:rFonts w:ascii="Aptos" w:hAnsi="Aptos" w:eastAsia="Aptos" w:cs="" w:asciiTheme="minorHAnsi" w:cstheme="minorBidi" w:eastAsiaTheme="minorHAnsi" w:hAnsiTheme="minorHAnsi"/>
         <w:kern w:val="2"/>
         <w:sz w:val="22"/>
         <w:szCs w:val="22"/>
@@ -359,21 +558,21 @@
     </w:rPrDefault>
     <w:pPrDefault>
       <w:pPr>
-        <w:spacing w:after="160" w:line="259" w:lineRule="auto"/>
+        <w:suppressAutoHyphens w:val="true"/>
       </w:pPr>
     </w:pPrDefault>
   </w:docDefaults>
   <w:latentStyles w:defLockedState="0" w:defUIPriority="99" w:defSemiHidden="0" w:defUnhideWhenUsed="0" w:defQFormat="0" w:count="376">
     <w:lsdException w:name="Normal" w:uiPriority="0" w:qFormat="1"/>
     <w:lsdException w:name="heading 1" w:uiPriority="9" w:qFormat="1"/>
-    <w:lsdException w:name="heading 2" w:semiHidden="1" w:uiPriority="9" w:unhideWhenUsed="1" w:qFormat="1"/>
-    <w:lsdException w:name="heading 3" w:semiHidden="1" w:uiPriority="9" w:unhideWhenUsed="1" w:qFormat="1"/>
-    <w:lsdException w:name="heading 4" w:semiHidden="1" w:uiPriority="9" w:unhideWhenUsed="1" w:qFormat="1"/>
-    <w:lsdException w:name="heading 5" w:semiHidden="1" w:uiPriority="9" w:unhideWhenUsed="1" w:qFormat="1"/>
-    <w:lsdException w:name="heading 6" w:semiHidden="1" w:uiPriority="9" w:unhideWhenUsed="1" w:qFormat="1"/>
-    <w:lsdException w:name="heading 7" w:semiHidden="1" w:uiPriority="9" w:unhideWhenUsed="1" w:qFormat="1"/>
-    <w:lsdException w:name="heading 8" w:semiHidden="1" w:uiPriority="9" w:unhideWhenUsed="1" w:qFormat="1"/>
-    <w:lsdException w:name="heading 9" w:semiHidden="1" w:uiPriority="9" w:unhideWhenUsed="1" w:qFormat="1"/>
+    <w:lsdException w:name="heading 2" w:uiPriority="9" w:semiHidden="1" w:unhideWhenUsed="1" w:qFormat="1"/>
+    <w:lsdException w:name="heading 3" w:uiPriority="9" w:semiHidden="1" w:unhideWhenUsed="1" w:qFormat="1"/>
+    <w:lsdException w:name="heading 4" w:uiPriority="9" w:semiHidden="1" w:unhideWhenUsed="1" w:qFormat="1"/>
+    <w:lsdException w:name="heading 5" w:uiPriority="9" w:semiHidden="1" w:unhideWhenUsed="1" w:qFormat="1"/>
+    <w:lsdException w:name="heading 6" w:uiPriority="9" w:semiHidden="1" w:unhideWhenUsed="1" w:qFormat="1"/>
+    <w:lsdException w:name="heading 7" w:uiPriority="9" w:semiHidden="1" w:unhideWhenUsed="1" w:qFormat="1"/>
+    <w:lsdException w:name="heading 8" w:uiPriority="9" w:semiHidden="1" w:unhideWhenUsed="1" w:qFormat="1"/>
+    <w:lsdException w:name="heading 9" w:uiPriority="9" w:semiHidden="1" w:unhideWhenUsed="1" w:qFormat="1"/>
     <w:lsdException w:name="index 1" w:semiHidden="1" w:unhideWhenUsed="1"/>
     <w:lsdException w:name="index 2" w:semiHidden="1" w:unhideWhenUsed="1"/>
     <w:lsdException w:name="index 3" w:semiHidden="1" w:unhideWhenUsed="1"/>
@@ -383,22 +582,22 @@
     <w:lsdException w:name="index 7" w:semiHidden="1" w:unhideWhenUsed="1"/>
     <w:lsdException w:name="index 8" w:semiHidden="1" w:unhideWhenUsed="1"/>
     <w:lsdException w:name="index 9" w:semiHidden="1" w:unhideWhenUsed="1"/>
-    <w:lsdException w:name="toc 1" w:semiHidden="1" w:uiPriority="39" w:unhideWhenUsed="1"/>
-    <w:lsdException w:name="toc 2" w:semiHidden="1" w:uiPriority="39" w:unhideWhenUsed="1"/>
-    <w:lsdException w:name="toc 3" w:semiHidden="1" w:uiPriority="39" w:unhideWhenUsed="1"/>
-    <w:lsdException w:name="toc 4" w:semiHidden="1" w:uiPriority="39" w:unhideWhenUsed="1"/>
-    <w:lsdException w:name="toc 5" w:semiHidden="1" w:uiPriority="39" w:unhideWhenUsed="1"/>
-    <w:lsdException w:name="toc 6" w:semiHidden="1" w:uiPriority="39" w:unhideWhenUsed="1"/>
-    <w:lsdException w:name="toc 7" w:semiHidden="1" w:uiPriority="39" w:unhideWhenUsed="1"/>
-    <w:lsdException w:name="toc 8" w:semiHidden="1" w:uiPriority="39" w:unhideWhenUsed="1"/>
-    <w:lsdException w:name="toc 9" w:semiHidden="1" w:uiPriority="39" w:unhideWhenUsed="1"/>
+    <w:lsdException w:name="toc 1" w:uiPriority="39" w:semiHidden="1" w:unhideWhenUsed="1"/>
+    <w:lsdException w:name="toc 2" w:uiPriority="39" w:semiHidden="1" w:unhideWhenUsed="1"/>
+    <w:lsdException w:name="toc 3" w:uiPriority="39" w:semiHidden="1" w:unhideWhenUsed="1"/>
+    <w:lsdException w:name="toc 4" w:uiPriority="39" w:semiHidden="1" w:unhideWhenUsed="1"/>
+    <w:lsdException w:name="toc 5" w:uiPriority="39" w:semiHidden="1" w:unhideWhenUsed="1"/>
+    <w:lsdException w:name="toc 6" w:uiPriority="39" w:semiHidden="1" w:unhideWhenUsed="1"/>
+    <w:lsdException w:name="toc 7" w:uiPriority="39" w:semiHidden="1" w:unhideWhenUsed="1"/>
+    <w:lsdException w:name="toc 8" w:uiPriority="39" w:semiHidden="1" w:unhideWhenUsed="1"/>
+    <w:lsdException w:name="toc 9" w:uiPriority="39" w:semiHidden="1" w:unhideWhenUsed="1"/>
     <w:lsdException w:name="Normal Indent" w:semiHidden="1" w:unhideWhenUsed="1"/>
     <w:lsdException w:name="footnote text" w:semiHidden="1" w:unhideWhenUsed="1"/>
     <w:lsdException w:name="annotation text" w:semiHidden="1" w:unhideWhenUsed="1"/>
     <w:lsdException w:name="header" w:semiHidden="1" w:unhideWhenUsed="1"/>
     <w:lsdException w:name="footer" w:semiHidden="1" w:unhideWhenUsed="1"/>
     <w:lsdException w:name="index heading" w:semiHidden="1" w:unhideWhenUsed="1"/>
-    <w:lsdException w:name="caption" w:semiHidden="1" w:uiPriority="35" w:unhideWhenUsed="1" w:qFormat="1"/>
+    <w:lsdException w:name="caption" w:uiPriority="35" w:semiHidden="1" w:unhideWhenUsed="1" w:qFormat="1"/>
     <w:lsdException w:name="table of figures" w:semiHidden="1" w:unhideWhenUsed="1"/>
     <w:lsdException w:name="envelope address" w:semiHidden="1" w:unhideWhenUsed="1"/>
     <w:lsdException w:name="envelope return" w:semiHidden="1" w:unhideWhenUsed="1"/>
@@ -429,7 +628,7 @@
     <w:lsdException w:name="Title" w:uiPriority="10" w:qFormat="1"/>
     <w:lsdException w:name="Closing" w:semiHidden="1" w:unhideWhenUsed="1"/>
     <w:lsdException w:name="Signature" w:semiHidden="1" w:unhideWhenUsed="1"/>
-    <w:lsdException w:name="Default Paragraph Font" w:semiHidden="1" w:uiPriority="1" w:unhideWhenUsed="1"/>
+    <w:lsdException w:name="Default Paragraph Font" w:uiPriority="1" w:semiHidden="1" w:unhideWhenUsed="1"/>
     <w:lsdException w:name="Body Text" w:semiHidden="1" w:unhideWhenUsed="1"/>
     <w:lsdException w:name="Body Text Indent" w:semiHidden="1" w:unhideWhenUsed="1"/>
     <w:lsdException w:name="List Continue" w:semiHidden="1" w:unhideWhenUsed="1"/>
@@ -629,8 +828,8 @@
     <w:lsdException w:name="Subtle Reference" w:uiPriority="31" w:qFormat="1"/>
     <w:lsdException w:name="Intense Reference" w:uiPriority="32" w:qFormat="1"/>
     <w:lsdException w:name="Book Title" w:uiPriority="33" w:qFormat="1"/>
-    <w:lsdException w:name="Bibliography" w:semiHidden="1" w:uiPriority="37" w:unhideWhenUsed="1"/>
-    <w:lsdException w:name="TOC Heading" w:semiHidden="1" w:uiPriority="39" w:unhideWhenUsed="1" w:qFormat="1"/>
+    <w:lsdException w:name="Bibliography" w:uiPriority="37" w:semiHidden="1" w:unhideWhenUsed="1"/>
+    <w:lsdException w:name="TOC Heading" w:uiPriority="39" w:semiHidden="1" w:unhideWhenUsed="1" w:qFormat="1"/>
     <w:lsdException w:name="Plain Table 1" w:uiPriority="41"/>
     <w:lsdException w:name="Plain Table 2" w:uiPriority="42"/>
     <w:lsdException w:name="Plain Table 3" w:uiPriority="43"/>
@@ -741,35 +940,43 @@
     <w:lsdException w:name="Unresolved Mention" w:semiHidden="1" w:unhideWhenUsed="1"/>
     <w:lsdException w:name="Smart Link" w:semiHidden="1" w:unhideWhenUsed="1"/>
   </w:latentStyles>
-  <w:style w:type="paragraph" w:default="1" w:styleId="Normal">
+  <w:style w:type="paragraph" w:styleId="Normal" w:default="1">
     <w:name w:val="Normal"/>
     <w:qFormat/>
-    <w:rsid w:val="005358E0"/>
-    <w:pPr>
-      <w:spacing w:after="0" w:line="240" w:lineRule="auto"/>
-    </w:pPr>
-    <w:rPr>
+    <w:rsid w:val="005358e0"/>
+    <w:pPr>
+      <w:widowControl/>
+      <w:bidi w:val="0"/>
+      <w:spacing w:lineRule="auto" w:line="240" w:before="0" w:after="0"/>
+      <w:jc w:val="left"/>
+    </w:pPr>
+    <w:rPr>
+      <w:rFonts w:ascii="Aptos" w:hAnsi="Aptos" w:eastAsia="Aptos" w:cs=""/>
+      <w:color w:val="auto"/>
       <w:kern w:val="0"/>
+      <w:sz w:val="22"/>
+      <w:szCs w:val="22"/>
+      <w:lang w:val="es-CO" w:eastAsia="en-US" w:bidi="ar-SA"/>
       <w14:ligatures w14:val="none"/>
     </w:rPr>
   </w:style>
   <w:style w:type="paragraph" w:styleId="Ttulo1">
-    <w:name w:val="heading 1"/>
+    <w:name w:val="Heading 1"/>
     <w:basedOn w:val="Normal"/>
     <w:next w:val="Normal"/>
     <w:link w:val="Ttulo1Car"/>
     <w:uiPriority w:val="9"/>
     <w:qFormat/>
-    <w:rsid w:val="005358E0"/>
-    <w:pPr>
-      <w:keepNext/>
+    <w:rsid w:val="005358e0"/>
+    <w:pPr>
+      <w:keepNext w:val="true"/>
       <w:keepLines/>
-      <w:spacing w:before="360" w:after="80" w:line="259" w:lineRule="auto"/>
+      <w:spacing w:lineRule="auto" w:line="259" w:before="360" w:after="80"/>
       <w:outlineLvl w:val="0"/>
     </w:pPr>
     <w:rPr>
-      <w:rFonts w:asciiTheme="majorHAnsi" w:eastAsiaTheme="majorEastAsia" w:hAnsiTheme="majorHAnsi" w:cstheme="majorBidi"/>
-      <w:color w:val="0F4761" w:themeColor="accent1" w:themeShade="BF"/>
+      <w:rFonts w:ascii="Aptos Display" w:hAnsi="Aptos Display" w:eastAsia="" w:cs="" w:asciiTheme="majorHAnsi" w:cstheme="majorBidi" w:eastAsiaTheme="majorEastAsia" w:hAnsiTheme="majorHAnsi"/>
+      <w:color w:val="0F4761" w:themeColor="accent1" w:themeShade="bf"/>
       <w:kern w:val="2"/>
       <w:sz w:val="40"/>
       <w:szCs w:val="40"/>
@@ -777,7 +984,7 @@
     </w:rPr>
   </w:style>
   <w:style w:type="paragraph" w:styleId="Ttulo2">
-    <w:name w:val="heading 2"/>
+    <w:name w:val="Heading 2"/>
     <w:basedOn w:val="Normal"/>
     <w:next w:val="Normal"/>
     <w:link w:val="Ttulo2Car"/>
@@ -785,16 +992,16 @@
     <w:semiHidden/>
     <w:unhideWhenUsed/>
     <w:qFormat/>
-    <w:rsid w:val="005358E0"/>
-    <w:pPr>
-      <w:keepNext/>
+    <w:rsid w:val="005358e0"/>
+    <w:pPr>
+      <w:keepNext w:val="true"/>
       <w:keepLines/>
-      <w:spacing w:before="160" w:after="80" w:line="259" w:lineRule="auto"/>
+      <w:spacing w:lineRule="auto" w:line="259" w:before="160" w:after="80"/>
       <w:outlineLvl w:val="1"/>
     </w:pPr>
     <w:rPr>
-      <w:rFonts w:asciiTheme="majorHAnsi" w:eastAsiaTheme="majorEastAsia" w:hAnsiTheme="majorHAnsi" w:cstheme="majorBidi"/>
-      <w:color w:val="0F4761" w:themeColor="accent1" w:themeShade="BF"/>
+      <w:rFonts w:ascii="Aptos Display" w:hAnsi="Aptos Display" w:eastAsia="" w:cs="" w:asciiTheme="majorHAnsi" w:cstheme="majorBidi" w:eastAsiaTheme="majorEastAsia" w:hAnsiTheme="majorHAnsi"/>
+      <w:color w:val="0F4761" w:themeColor="accent1" w:themeShade="bf"/>
       <w:kern w:val="2"/>
       <w:sz w:val="32"/>
       <w:szCs w:val="32"/>
@@ -802,7 +1009,7 @@
     </w:rPr>
   </w:style>
   <w:style w:type="paragraph" w:styleId="Ttulo3">
-    <w:name w:val="heading 3"/>
+    <w:name w:val="Heading 3"/>
     <w:basedOn w:val="Normal"/>
     <w:next w:val="Normal"/>
     <w:link w:val="Ttulo3Car"/>
@@ -810,16 +1017,16 @@
     <w:semiHidden/>
     <w:unhideWhenUsed/>
     <w:qFormat/>
-    <w:rsid w:val="005358E0"/>
-    <w:pPr>
-      <w:keepNext/>
+    <w:rsid w:val="005358e0"/>
+    <w:pPr>
+      <w:keepNext w:val="true"/>
       <w:keepLines/>
-      <w:spacing w:before="160" w:after="80" w:line="259" w:lineRule="auto"/>
+      <w:spacing w:lineRule="auto" w:line="259" w:before="160" w:after="80"/>
       <w:outlineLvl w:val="2"/>
     </w:pPr>
     <w:rPr>
-      <w:rFonts w:eastAsiaTheme="majorEastAsia" w:cstheme="majorBidi"/>
-      <w:color w:val="0F4761" w:themeColor="accent1" w:themeShade="BF"/>
+      <w:rFonts w:eastAsia="" w:cs="" w:cstheme="majorBidi" w:eastAsiaTheme="majorEastAsia"/>
+      <w:color w:val="0F4761" w:themeColor="accent1" w:themeShade="bf"/>
       <w:kern w:val="2"/>
       <w:sz w:val="28"/>
       <w:szCs w:val="28"/>
@@ -827,7 +1034,7 @@
     </w:rPr>
   </w:style>
   <w:style w:type="paragraph" w:styleId="Ttulo4">
-    <w:name w:val="heading 4"/>
+    <w:name w:val="Heading 4"/>
     <w:basedOn w:val="Normal"/>
     <w:next w:val="Normal"/>
     <w:link w:val="Ttulo4Car"/>
@@ -835,24 +1042,24 @@
     <w:semiHidden/>
     <w:unhideWhenUsed/>
     <w:qFormat/>
-    <w:rsid w:val="005358E0"/>
-    <w:pPr>
-      <w:keepNext/>
+    <w:rsid w:val="005358e0"/>
+    <w:pPr>
+      <w:keepNext w:val="true"/>
       <w:keepLines/>
-      <w:spacing w:before="80" w:after="40" w:line="259" w:lineRule="auto"/>
+      <w:spacing w:lineRule="auto" w:line="259" w:before="80" w:after="40"/>
       <w:outlineLvl w:val="3"/>
     </w:pPr>
     <w:rPr>
-      <w:rFonts w:eastAsiaTheme="majorEastAsia" w:cstheme="majorBidi"/>
+      <w:rFonts w:eastAsia="" w:cs="" w:cstheme="majorBidi" w:eastAsiaTheme="majorEastAsia"/>
       <w:i/>
       <w:iCs/>
-      <w:color w:val="0F4761" w:themeColor="accent1" w:themeShade="BF"/>
+      <w:color w:val="0F4761" w:themeColor="accent1" w:themeShade="bf"/>
       <w:kern w:val="2"/>
       <w14:ligatures w14:val="standardContextual"/>
     </w:rPr>
   </w:style>
   <w:style w:type="paragraph" w:styleId="Ttulo5">
-    <w:name w:val="heading 5"/>
+    <w:name w:val="Heading 5"/>
     <w:basedOn w:val="Normal"/>
     <w:next w:val="Normal"/>
     <w:link w:val="Ttulo5Car"/>
@@ -860,22 +1067,22 @@
     <w:semiHidden/>
     <w:unhideWhenUsed/>
     <w:qFormat/>
-    <w:rsid w:val="005358E0"/>
-    <w:pPr>
-      <w:keepNext/>
+    <w:rsid w:val="005358e0"/>
+    <w:pPr>
+      <w:keepNext w:val="true"/>
       <w:keepLines/>
-      <w:spacing w:before="80" w:after="40" w:line="259" w:lineRule="auto"/>
+      <w:spacing w:lineRule="auto" w:line="259" w:before="80" w:after="40"/>
       <w:outlineLvl w:val="4"/>
     </w:pPr>
     <w:rPr>
-      <w:rFonts w:eastAsiaTheme="majorEastAsia" w:cstheme="majorBidi"/>
-      <w:color w:val="0F4761" w:themeColor="accent1" w:themeShade="BF"/>
+      <w:rFonts w:eastAsia="" w:cs="" w:cstheme="majorBidi" w:eastAsiaTheme="majorEastAsia"/>
+      <w:color w:val="0F4761" w:themeColor="accent1" w:themeShade="bf"/>
       <w:kern w:val="2"/>
       <w14:ligatures w14:val="standardContextual"/>
     </w:rPr>
   </w:style>
   <w:style w:type="paragraph" w:styleId="Ttulo6">
-    <w:name w:val="heading 6"/>
+    <w:name w:val="Heading 6"/>
     <w:basedOn w:val="Normal"/>
     <w:next w:val="Normal"/>
     <w:link w:val="Ttulo6Car"/>
@@ -883,24 +1090,24 @@
     <w:semiHidden/>
     <w:unhideWhenUsed/>
     <w:qFormat/>
-    <w:rsid w:val="005358E0"/>
-    <w:pPr>
-      <w:keepNext/>
+    <w:rsid w:val="005358e0"/>
+    <w:pPr>
+      <w:keepNext w:val="true"/>
       <w:keepLines/>
-      <w:spacing w:before="40" w:line="259" w:lineRule="auto"/>
+      <w:spacing w:lineRule="auto" w:line="259" w:before="40" w:after="0"/>
       <w:outlineLvl w:val="5"/>
     </w:pPr>
     <w:rPr>
-      <w:rFonts w:eastAsiaTheme="majorEastAsia" w:cstheme="majorBidi"/>
+      <w:rFonts w:eastAsia="" w:cs="" w:cstheme="majorBidi" w:eastAsiaTheme="majorEastAsia"/>
       <w:i/>
       <w:iCs/>
-      <w:color w:val="595959" w:themeColor="text1" w:themeTint="A6"/>
+      <w:color w:val="595959" w:themeColor="text1" w:themeTint="a6"/>
       <w:kern w:val="2"/>
       <w14:ligatures w14:val="standardContextual"/>
     </w:rPr>
   </w:style>
   <w:style w:type="paragraph" w:styleId="Ttulo7">
-    <w:name w:val="heading 7"/>
+    <w:name w:val="Heading 7"/>
     <w:basedOn w:val="Normal"/>
     <w:next w:val="Normal"/>
     <w:link w:val="Ttulo7Car"/>
@@ -908,22 +1115,22 @@
     <w:semiHidden/>
     <w:unhideWhenUsed/>
     <w:qFormat/>
-    <w:rsid w:val="005358E0"/>
-    <w:pPr>
-      <w:keepNext/>
+    <w:rsid w:val="005358e0"/>
+    <w:pPr>
+      <w:keepNext w:val="true"/>
       <w:keepLines/>
-      <w:spacing w:before="40" w:line="259" w:lineRule="auto"/>
+      <w:spacing w:lineRule="auto" w:line="259" w:before="40" w:after="0"/>
       <w:outlineLvl w:val="6"/>
     </w:pPr>
     <w:rPr>
-      <w:rFonts w:eastAsiaTheme="majorEastAsia" w:cstheme="majorBidi"/>
-      <w:color w:val="595959" w:themeColor="text1" w:themeTint="A6"/>
+      <w:rFonts w:eastAsia="" w:cs="" w:cstheme="majorBidi" w:eastAsiaTheme="majorEastAsia"/>
+      <w:color w:val="595959" w:themeColor="text1" w:themeTint="a6"/>
       <w:kern w:val="2"/>
       <w14:ligatures w14:val="standardContextual"/>
     </w:rPr>
   </w:style>
   <w:style w:type="paragraph" w:styleId="Ttulo8">
-    <w:name w:val="heading 8"/>
+    <w:name w:val="Heading 8"/>
     <w:basedOn w:val="Normal"/>
     <w:next w:val="Normal"/>
     <w:link w:val="Ttulo8Car"/>
@@ -931,24 +1138,24 @@
     <w:semiHidden/>
     <w:unhideWhenUsed/>
     <w:qFormat/>
-    <w:rsid w:val="005358E0"/>
-    <w:pPr>
-      <w:keepNext/>
+    <w:rsid w:val="005358e0"/>
+    <w:pPr>
+      <w:keepNext w:val="true"/>
       <w:keepLines/>
-      <w:spacing w:line="259" w:lineRule="auto"/>
+      <w:spacing w:lineRule="auto" w:line="259"/>
       <w:outlineLvl w:val="7"/>
     </w:pPr>
     <w:rPr>
-      <w:rFonts w:eastAsiaTheme="majorEastAsia" w:cstheme="majorBidi"/>
+      <w:rFonts w:eastAsia="" w:cs="" w:cstheme="majorBidi" w:eastAsiaTheme="majorEastAsia"/>
       <w:i/>
       <w:iCs/>
-      <w:color w:val="272727" w:themeColor="text1" w:themeTint="D8"/>
+      <w:color w:val="272727" w:themeColor="text1" w:themeTint="d8"/>
       <w:kern w:val="2"/>
       <w14:ligatures w14:val="standardContextual"/>
     </w:rPr>
   </w:style>
   <w:style w:type="paragraph" w:styleId="Ttulo9">
-    <w:name w:val="heading 9"/>
+    <w:name w:val="Heading 9"/>
     <w:basedOn w:val="Normal"/>
     <w:next w:val="Normal"/>
     <w:link w:val="Ttulo9Car"/>
@@ -956,24 +1163,455 @@
     <w:semiHidden/>
     <w:unhideWhenUsed/>
     <w:qFormat/>
-    <w:rsid w:val="005358E0"/>
-    <w:pPr>
-      <w:keepNext/>
+    <w:rsid w:val="005358e0"/>
+    <w:pPr>
+      <w:keepNext w:val="true"/>
       <w:keepLines/>
-      <w:spacing w:line="259" w:lineRule="auto"/>
+      <w:spacing w:lineRule="auto" w:line="259"/>
       <w:outlineLvl w:val="8"/>
     </w:pPr>
     <w:rPr>
-      <w:rFonts w:eastAsiaTheme="majorEastAsia" w:cstheme="majorBidi"/>
-      <w:color w:val="272727" w:themeColor="text1" w:themeTint="D8"/>
+      <w:rFonts w:eastAsia="" w:cs="" w:cstheme="majorBidi" w:eastAsiaTheme="majorEastAsia"/>
+      <w:color w:val="272727" w:themeColor="text1" w:themeTint="d8"/>
       <w:kern w:val="2"/>
       <w14:ligatures w14:val="standardContextual"/>
     </w:rPr>
   </w:style>
-  <w:style w:type="character" w:default="1" w:styleId="Fuentedeprrafopredeter">
+  <w:style w:type="character" w:styleId="DefaultParagraphFont" w:default="1">
     <w:name w:val="Default Paragraph Font"/>
     <w:uiPriority w:val="1"/>
     <w:unhideWhenUsed/>
+    <w:qFormat/>
+    <w:rPr/>
+  </w:style>
+  <w:style w:type="character" w:styleId="Ttulo1Car" w:customStyle="1">
+    <w:name w:val="Título 1 Car"/>
+    <w:basedOn w:val="DefaultParagraphFont"/>
+    <w:uiPriority w:val="9"/>
+    <w:qFormat/>
+    <w:rsid w:val="005358e0"/>
+    <w:rPr>
+      <w:rFonts w:ascii="Aptos Display" w:hAnsi="Aptos Display" w:eastAsia="" w:cs="" w:asciiTheme="majorHAnsi" w:cstheme="majorBidi" w:eastAsiaTheme="majorEastAsia" w:hAnsiTheme="majorHAnsi"/>
+      <w:color w:val="0F4761" w:themeColor="accent1" w:themeShade="bf"/>
+      <w:sz w:val="40"/>
+      <w:szCs w:val="40"/>
+    </w:rPr>
+  </w:style>
+  <w:style w:type="character" w:styleId="Ttulo2Car" w:customStyle="1">
+    <w:name w:val="Título 2 Car"/>
+    <w:basedOn w:val="DefaultParagraphFont"/>
+    <w:uiPriority w:val="9"/>
+    <w:semiHidden/>
+    <w:qFormat/>
+    <w:rsid w:val="005358e0"/>
+    <w:rPr>
+      <w:rFonts w:ascii="Aptos Display" w:hAnsi="Aptos Display" w:eastAsia="" w:cs="" w:asciiTheme="majorHAnsi" w:cstheme="majorBidi" w:eastAsiaTheme="majorEastAsia" w:hAnsiTheme="majorHAnsi"/>
+      <w:color w:val="0F4761" w:themeColor="accent1" w:themeShade="bf"/>
+      <w:sz w:val="32"/>
+      <w:szCs w:val="32"/>
+    </w:rPr>
+  </w:style>
+  <w:style w:type="character" w:styleId="Ttulo3Car" w:customStyle="1">
+    <w:name w:val="Título 3 Car"/>
+    <w:basedOn w:val="DefaultParagraphFont"/>
+    <w:uiPriority w:val="9"/>
+    <w:semiHidden/>
+    <w:qFormat/>
+    <w:rsid w:val="005358e0"/>
+    <w:rPr>
+      <w:rFonts w:eastAsia="" w:cs="" w:cstheme="majorBidi" w:eastAsiaTheme="majorEastAsia"/>
+      <w:color w:val="0F4761" w:themeColor="accent1" w:themeShade="bf"/>
+      <w:sz w:val="28"/>
+      <w:szCs w:val="28"/>
+    </w:rPr>
+  </w:style>
+  <w:style w:type="character" w:styleId="Ttulo4Car" w:customStyle="1">
+    <w:name w:val="Título 4 Car"/>
+    <w:basedOn w:val="DefaultParagraphFont"/>
+    <w:uiPriority w:val="9"/>
+    <w:semiHidden/>
+    <w:qFormat/>
+    <w:rsid w:val="005358e0"/>
+    <w:rPr>
+      <w:rFonts w:eastAsia="" w:cs="" w:cstheme="majorBidi" w:eastAsiaTheme="majorEastAsia"/>
+      <w:i/>
+      <w:iCs/>
+      <w:color w:val="0F4761" w:themeColor="accent1" w:themeShade="bf"/>
+    </w:rPr>
+  </w:style>
+  <w:style w:type="character" w:styleId="Ttulo5Car" w:customStyle="1">
+    <w:name w:val="Título 5 Car"/>
+    <w:basedOn w:val="DefaultParagraphFont"/>
+    <w:uiPriority w:val="9"/>
+    <w:semiHidden/>
+    <w:qFormat/>
+    <w:rsid w:val="005358e0"/>
+    <w:rPr>
+      <w:rFonts w:eastAsia="" w:cs="" w:cstheme="majorBidi" w:eastAsiaTheme="majorEastAsia"/>
+      <w:color w:val="0F4761" w:themeColor="accent1" w:themeShade="bf"/>
+    </w:rPr>
+  </w:style>
+  <w:style w:type="character" w:styleId="Ttulo6Car" w:customStyle="1">
+    <w:name w:val="Título 6 Car"/>
+    <w:basedOn w:val="DefaultParagraphFont"/>
+    <w:uiPriority w:val="9"/>
+    <w:semiHidden/>
+    <w:qFormat/>
+    <w:rsid w:val="005358e0"/>
+    <w:rPr>
+      <w:rFonts w:eastAsia="" w:cs="" w:cstheme="majorBidi" w:eastAsiaTheme="majorEastAsia"/>
+      <w:i/>
+      <w:iCs/>
+      <w:color w:val="595959" w:themeColor="text1" w:themeTint="a6"/>
+    </w:rPr>
+  </w:style>
+  <w:style w:type="character" w:styleId="Ttulo7Car" w:customStyle="1">
+    <w:name w:val="Título 7 Car"/>
+    <w:basedOn w:val="DefaultParagraphFont"/>
+    <w:uiPriority w:val="9"/>
+    <w:semiHidden/>
+    <w:qFormat/>
+    <w:rsid w:val="005358e0"/>
+    <w:rPr>
+      <w:rFonts w:eastAsia="" w:cs="" w:cstheme="majorBidi" w:eastAsiaTheme="majorEastAsia"/>
+      <w:color w:val="595959" w:themeColor="text1" w:themeTint="a6"/>
+    </w:rPr>
+  </w:style>
+  <w:style w:type="character" w:styleId="Ttulo8Car" w:customStyle="1">
+    <w:name w:val="Título 8 Car"/>
+    <w:basedOn w:val="DefaultParagraphFont"/>
+    <w:uiPriority w:val="9"/>
+    <w:semiHidden/>
+    <w:qFormat/>
+    <w:rsid w:val="005358e0"/>
+    <w:rPr>
+      <w:rFonts w:eastAsia="" w:cs="" w:cstheme="majorBidi" w:eastAsiaTheme="majorEastAsia"/>
+      <w:i/>
+      <w:iCs/>
+      <w:color w:val="272727" w:themeColor="text1" w:themeTint="d8"/>
+    </w:rPr>
+  </w:style>
+  <w:style w:type="character" w:styleId="Ttulo9Car" w:customStyle="1">
+    <w:name w:val="Título 9 Car"/>
+    <w:basedOn w:val="DefaultParagraphFont"/>
+    <w:uiPriority w:val="9"/>
+    <w:semiHidden/>
+    <w:qFormat/>
+    <w:rsid w:val="005358e0"/>
+    <w:rPr>
+      <w:rFonts w:eastAsia="" w:cs="" w:cstheme="majorBidi" w:eastAsiaTheme="majorEastAsia"/>
+      <w:color w:val="272727" w:themeColor="text1" w:themeTint="d8"/>
+    </w:rPr>
+  </w:style>
+  <w:style w:type="character" w:styleId="TtuloCar" w:customStyle="1">
+    <w:name w:val="Título Car"/>
+    <w:basedOn w:val="DefaultParagraphFont"/>
+    <w:uiPriority w:val="10"/>
+    <w:qFormat/>
+    <w:rsid w:val="005358e0"/>
+    <w:rPr>
+      <w:rFonts w:ascii="Aptos Display" w:hAnsi="Aptos Display" w:eastAsia="" w:cs="" w:asciiTheme="majorHAnsi" w:cstheme="majorBidi" w:eastAsiaTheme="majorEastAsia" w:hAnsiTheme="majorHAnsi"/>
+      <w:spacing w:val="-10"/>
+      <w:kern w:val="2"/>
+      <w:sz w:val="56"/>
+      <w:szCs w:val="56"/>
+    </w:rPr>
+  </w:style>
+  <w:style w:type="character" w:styleId="SubttuloCar" w:customStyle="1">
+    <w:name w:val="Subtítulo Car"/>
+    <w:basedOn w:val="DefaultParagraphFont"/>
+    <w:uiPriority w:val="11"/>
+    <w:qFormat/>
+    <w:rsid w:val="005358e0"/>
+    <w:rPr>
+      <w:rFonts w:eastAsia="" w:cs="" w:cstheme="majorBidi" w:eastAsiaTheme="majorEastAsia"/>
+      <w:color w:val="595959" w:themeColor="text1" w:themeTint="a6"/>
+      <w:spacing w:val="15"/>
+      <w:sz w:val="28"/>
+      <w:szCs w:val="28"/>
+    </w:rPr>
+  </w:style>
+  <w:style w:type="character" w:styleId="CitaCar" w:customStyle="1">
+    <w:name w:val="Cita Car"/>
+    <w:basedOn w:val="DefaultParagraphFont"/>
+    <w:link w:val="Quote"/>
+    <w:uiPriority w:val="29"/>
+    <w:qFormat/>
+    <w:rsid w:val="005358e0"/>
+    <w:rPr>
+      <w:i/>
+      <w:iCs/>
+      <w:color w:val="404040" w:themeColor="text1" w:themeTint="bf"/>
+    </w:rPr>
+  </w:style>
+  <w:style w:type="character" w:styleId="IntenseEmphasis">
+    <w:name w:val="Intense Emphasis"/>
+    <w:basedOn w:val="DefaultParagraphFont"/>
+    <w:uiPriority w:val="21"/>
+    <w:qFormat/>
+    <w:rsid w:val="005358e0"/>
+    <w:rPr>
+      <w:i/>
+      <w:iCs/>
+      <w:color w:val="0F4761" w:themeColor="accent1" w:themeShade="bf"/>
+    </w:rPr>
+  </w:style>
+  <w:style w:type="character" w:styleId="CitadestacadaCar" w:customStyle="1">
+    <w:name w:val="Cita destacada Car"/>
+    <w:basedOn w:val="DefaultParagraphFont"/>
+    <w:link w:val="IntenseQuote"/>
+    <w:uiPriority w:val="30"/>
+    <w:qFormat/>
+    <w:rsid w:val="005358e0"/>
+    <w:rPr>
+      <w:i/>
+      <w:iCs/>
+      <w:color w:val="0F4761" w:themeColor="accent1" w:themeShade="bf"/>
+    </w:rPr>
+  </w:style>
+  <w:style w:type="character" w:styleId="IntenseReference">
+    <w:name w:val="Intense Reference"/>
+    <w:basedOn w:val="DefaultParagraphFont"/>
+    <w:uiPriority w:val="32"/>
+    <w:qFormat/>
+    <w:rsid w:val="005358e0"/>
+    <w:rPr>
+      <w:b/>
+      <w:bCs/>
+      <w:smallCaps/>
+      <w:color w:val="0F4761" w:themeColor="accent1" w:themeShade="bf"/>
+      <w:spacing w:val="5"/>
+    </w:rPr>
+  </w:style>
+  <w:style w:type="character" w:styleId="EncabezadoCar" w:customStyle="1">
+    <w:name w:val="Encabezado Car"/>
+    <w:basedOn w:val="DefaultParagraphFont"/>
+    <w:uiPriority w:val="99"/>
+    <w:qFormat/>
+    <w:rsid w:val="005358e0"/>
+    <w:rPr>
+      <w:kern w:val="0"/>
+      <w14:ligatures w14:val="none"/>
+    </w:rPr>
+  </w:style>
+  <w:style w:type="character" w:styleId="PiedepginaCar" w:customStyle="1">
+    <w:name w:val="Pie de página Car"/>
+    <w:basedOn w:val="DefaultParagraphFont"/>
+    <w:uiPriority w:val="99"/>
+    <w:qFormat/>
+    <w:rsid w:val="005358e0"/>
+    <w:rPr>
+      <w:kern w:val="0"/>
+      <w14:ligatures w14:val="none"/>
+    </w:rPr>
+  </w:style>
+  <w:style w:type="paragraph" w:styleId="Ttulo">
+    <w:name w:val="Título"/>
+    <w:basedOn w:val="Normal"/>
+    <w:next w:val="Cuerpodetexto"/>
+    <w:qFormat/>
+    <w:pPr>
+      <w:keepNext w:val="true"/>
+      <w:spacing w:before="240" w:after="120"/>
+    </w:pPr>
+    <w:rPr>
+      <w:rFonts w:ascii="Liberation Sans" w:hAnsi="Liberation Sans" w:eastAsia="Microsoft YaHei" w:cs="Lucida Sans"/>
+      <w:sz w:val="28"/>
+      <w:szCs w:val="28"/>
+    </w:rPr>
+  </w:style>
+  <w:style w:type="paragraph" w:styleId="Cuerpodetexto">
+    <w:name w:val="Body Text"/>
+    <w:basedOn w:val="Normal"/>
+    <w:pPr>
+      <w:spacing w:lineRule="auto" w:line="276" w:before="0" w:after="140"/>
+    </w:pPr>
+    <w:rPr/>
+  </w:style>
+  <w:style w:type="paragraph" w:styleId="List">
+    <w:name w:val="List"/>
+    <w:basedOn w:val="Cuerpodetexto"/>
+    <w:pPr/>
+    <w:rPr>
+      <w:rFonts w:cs="Lucida Sans"/>
+    </w:rPr>
+  </w:style>
+  <w:style w:type="paragraph" w:styleId="Leyenda">
+    <w:name w:val="Caption"/>
+    <w:basedOn w:val="Normal"/>
+    <w:qFormat/>
+    <w:pPr>
+      <w:suppressLineNumbers/>
+      <w:spacing w:before="120" w:after="120"/>
+    </w:pPr>
+    <w:rPr>
+      <w:rFonts w:cs="Lucida Sans"/>
+      <w:i/>
+      <w:iCs/>
+      <w:sz w:val="24"/>
+      <w:szCs w:val="24"/>
+    </w:rPr>
+  </w:style>
+  <w:style w:type="paragraph" w:styleId="Ndice">
+    <w:name w:val="Índice"/>
+    <w:basedOn w:val="Normal"/>
+    <w:qFormat/>
+    <w:pPr>
+      <w:suppressLineNumbers/>
+    </w:pPr>
+    <w:rPr>
+      <w:rFonts w:cs="Lucida Sans"/>
+      <w:lang w:val="zxx" w:eastAsia="zxx" w:bidi="zxx"/>
+    </w:rPr>
+  </w:style>
+  <w:style w:type="paragraph" w:styleId="Titular">
+    <w:name w:val="Title"/>
+    <w:basedOn w:val="Normal"/>
+    <w:next w:val="Normal"/>
+    <w:link w:val="TtuloCar"/>
+    <w:uiPriority w:val="10"/>
+    <w:qFormat/>
+    <w:rsid w:val="005358e0"/>
+    <w:pPr>
+      <w:spacing w:before="0" w:after="80"/>
+      <w:contextualSpacing/>
+    </w:pPr>
+    <w:rPr>
+      <w:rFonts w:ascii="Aptos Display" w:hAnsi="Aptos Display" w:eastAsia="" w:cs="" w:asciiTheme="majorHAnsi" w:cstheme="majorBidi" w:eastAsiaTheme="majorEastAsia" w:hAnsiTheme="majorHAnsi"/>
+      <w:spacing w:val="-10"/>
+      <w:kern w:val="2"/>
+      <w:sz w:val="56"/>
+      <w:szCs w:val="56"/>
+      <w14:ligatures w14:val="standardContextual"/>
+    </w:rPr>
+  </w:style>
+  <w:style w:type="paragraph" w:styleId="Subttulo">
+    <w:name w:val="Subtitle"/>
+    <w:basedOn w:val="Normal"/>
+    <w:next w:val="Normal"/>
+    <w:link w:val="SubttuloCar"/>
+    <w:uiPriority w:val="11"/>
+    <w:qFormat/>
+    <w:rsid w:val="005358e0"/>
+    <w:pPr>
+      <w:spacing w:lineRule="auto" w:line="259" w:before="0" w:after="160"/>
+    </w:pPr>
+    <w:rPr>
+      <w:rFonts w:eastAsia="" w:cs="" w:cstheme="majorBidi" w:eastAsiaTheme="majorEastAsia"/>
+      <w:color w:val="595959" w:themeColor="text1" w:themeTint="a6"/>
+      <w:spacing w:val="15"/>
+      <w:kern w:val="2"/>
+      <w:sz w:val="28"/>
+      <w:szCs w:val="28"/>
+      <w14:ligatures w14:val="standardContextual"/>
+    </w:rPr>
+  </w:style>
+  <w:style w:type="paragraph" w:styleId="Quote">
+    <w:name w:val="Quote"/>
+    <w:basedOn w:val="Normal"/>
+    <w:next w:val="Normal"/>
+    <w:link w:val="CitaCar"/>
+    <w:uiPriority w:val="29"/>
+    <w:qFormat/>
+    <w:rsid w:val="005358e0"/>
+    <w:pPr>
+      <w:spacing w:lineRule="auto" w:line="259" w:before="160" w:after="160"/>
+      <w:jc w:val="center"/>
+    </w:pPr>
+    <w:rPr>
+      <w:i/>
+      <w:iCs/>
+      <w:color w:val="404040" w:themeColor="text1" w:themeTint="bf"/>
+      <w:kern w:val="2"/>
+      <w14:ligatures w14:val="standardContextual"/>
+    </w:rPr>
+  </w:style>
+  <w:style w:type="paragraph" w:styleId="ListParagraph">
+    <w:name w:val="List Paragraph"/>
+    <w:basedOn w:val="Normal"/>
+    <w:uiPriority w:val="34"/>
+    <w:qFormat/>
+    <w:rsid w:val="005358e0"/>
+    <w:pPr>
+      <w:spacing w:lineRule="auto" w:line="259" w:before="0" w:after="160"/>
+      <w:ind w:left="720" w:hanging="0"/>
+      <w:contextualSpacing/>
+    </w:pPr>
+    <w:rPr>
+      <w:kern w:val="2"/>
+      <w14:ligatures w14:val="standardContextual"/>
+    </w:rPr>
+  </w:style>
+  <w:style w:type="paragraph" w:styleId="IntenseQuote">
+    <w:name w:val="Intense Quote"/>
+    <w:basedOn w:val="Normal"/>
+    <w:next w:val="Normal"/>
+    <w:link w:val="CitadestacadaCar"/>
+    <w:uiPriority w:val="30"/>
+    <w:qFormat/>
+    <w:rsid w:val="005358e0"/>
+    <w:pPr>
+      <w:pBdr>
+        <w:top w:val="single" w:sz="4" w:space="10" w:color="0F4761"/>
+        <w:bottom w:val="single" w:sz="4" w:space="10" w:color="0F4761"/>
+      </w:pBdr>
+      <w:spacing w:lineRule="auto" w:line="259" w:before="360" w:after="360"/>
+      <w:ind w:left="864" w:right="864" w:hanging="0"/>
+      <w:jc w:val="center"/>
+    </w:pPr>
+    <w:rPr>
+      <w:i/>
+      <w:iCs/>
+      <w:color w:val="0F4761" w:themeColor="accent1" w:themeShade="bf"/>
+      <w:kern w:val="2"/>
+      <w14:ligatures w14:val="standardContextual"/>
+    </w:rPr>
+  </w:style>
+  <w:style w:type="paragraph" w:styleId="HeaderandFooter">
+    <w:name w:val="Header and Footer"/>
+    <w:basedOn w:val="Normal"/>
+    <w:qFormat/>
+    <w:pPr/>
+    <w:rPr/>
+  </w:style>
+  <w:style w:type="paragraph" w:styleId="Cabecera">
+    <w:name w:val="Header"/>
+    <w:basedOn w:val="Normal"/>
+    <w:link w:val="EncabezadoCar"/>
+    <w:uiPriority w:val="99"/>
+    <w:unhideWhenUsed/>
+    <w:rsid w:val="005358e0"/>
+    <w:pPr>
+      <w:tabs>
+        <w:tab w:val="clear" w:pos="708"/>
+        <w:tab w:val="center" w:pos="4419" w:leader="none"/>
+        <w:tab w:val="right" w:pos="8838" w:leader="none"/>
+      </w:tabs>
+    </w:pPr>
+    <w:rPr/>
+  </w:style>
+  <w:style w:type="paragraph" w:styleId="Piedepgina">
+    <w:name w:val="Footer"/>
+    <w:basedOn w:val="Normal"/>
+    <w:link w:val="PiedepginaCar"/>
+    <w:uiPriority w:val="99"/>
+    <w:unhideWhenUsed/>
+    <w:rsid w:val="005358e0"/>
+    <w:pPr>
+      <w:tabs>
+        <w:tab w:val="clear" w:pos="708"/>
+        <w:tab w:val="center" w:pos="4419" w:leader="none"/>
+        <w:tab w:val="right" w:pos="8838" w:leader="none"/>
+      </w:tabs>
+    </w:pPr>
+    <w:rPr/>
+  </w:style>
+  <w:style w:type="numbering" w:styleId="NoList" w:default="1">
+    <w:name w:val="No List"/>
+    <w:uiPriority w:val="99"/>
+    <w:semiHidden/>
+    <w:unhideWhenUsed/>
+    <w:qFormat/>
   </w:style>
   <w:style w:type="table" w:default="1" w:styleId="Tablanormal">
     <w:name w:val="Normal Table"/>
@@ -981,7 +1619,6 @@
     <w:semiHidden/>
     <w:unhideWhenUsed/>
     <w:tblPr>
-      <w:tblInd w:w="0" w:type="dxa"/>
       <w:tblCellMar>
         <w:top w:w="0" w:type="dxa"/>
         <w:left w:w="108" w:type="dxa"/>
@@ -990,387 +1627,24 @@
       </w:tblCellMar>
     </w:tblPr>
   </w:style>
-  <w:style w:type="numbering" w:default="1" w:styleId="Sinlista">
-    <w:name w:val="No List"/>
-    <w:uiPriority w:val="99"/>
-    <w:semiHidden/>
-    <w:unhideWhenUsed/>
-  </w:style>
-  <w:style w:type="character" w:customStyle="1" w:styleId="Ttulo1Car">
-    <w:name w:val="Título 1 Car"/>
-    <w:basedOn w:val="Fuentedeprrafopredeter"/>
-    <w:link w:val="Ttulo1"/>
-    <w:uiPriority w:val="9"/>
-    <w:rsid w:val="005358E0"/>
-    <w:rPr>
-      <w:rFonts w:asciiTheme="majorHAnsi" w:eastAsiaTheme="majorEastAsia" w:hAnsiTheme="majorHAnsi" w:cstheme="majorBidi"/>
-      <w:color w:val="0F4761" w:themeColor="accent1" w:themeShade="BF"/>
-      <w:sz w:val="40"/>
-      <w:szCs w:val="40"/>
-    </w:rPr>
-  </w:style>
-  <w:style w:type="character" w:customStyle="1" w:styleId="Ttulo2Car">
-    <w:name w:val="Título 2 Car"/>
-    <w:basedOn w:val="Fuentedeprrafopredeter"/>
-    <w:link w:val="Ttulo2"/>
-    <w:uiPriority w:val="9"/>
-    <w:semiHidden/>
-    <w:rsid w:val="005358E0"/>
-    <w:rPr>
-      <w:rFonts w:asciiTheme="majorHAnsi" w:eastAsiaTheme="majorEastAsia" w:hAnsiTheme="majorHAnsi" w:cstheme="majorBidi"/>
-      <w:color w:val="0F4761" w:themeColor="accent1" w:themeShade="BF"/>
-      <w:sz w:val="32"/>
-      <w:szCs w:val="32"/>
-    </w:rPr>
-  </w:style>
-  <w:style w:type="character" w:customStyle="1" w:styleId="Ttulo3Car">
-    <w:name w:val="Título 3 Car"/>
-    <w:basedOn w:val="Fuentedeprrafopredeter"/>
-    <w:link w:val="Ttulo3"/>
-    <w:uiPriority w:val="9"/>
-    <w:semiHidden/>
-    <w:rsid w:val="005358E0"/>
-    <w:rPr>
-      <w:rFonts w:eastAsiaTheme="majorEastAsia" w:cstheme="majorBidi"/>
-      <w:color w:val="0F4761" w:themeColor="accent1" w:themeShade="BF"/>
-      <w:sz w:val="28"/>
-      <w:szCs w:val="28"/>
-    </w:rPr>
-  </w:style>
-  <w:style w:type="character" w:customStyle="1" w:styleId="Ttulo4Car">
-    <w:name w:val="Título 4 Car"/>
-    <w:basedOn w:val="Fuentedeprrafopredeter"/>
-    <w:link w:val="Ttulo4"/>
-    <w:uiPriority w:val="9"/>
-    <w:semiHidden/>
-    <w:rsid w:val="005358E0"/>
-    <w:rPr>
-      <w:rFonts w:eastAsiaTheme="majorEastAsia" w:cstheme="majorBidi"/>
-      <w:i/>
-      <w:iCs/>
-      <w:color w:val="0F4761" w:themeColor="accent1" w:themeShade="BF"/>
-    </w:rPr>
-  </w:style>
-  <w:style w:type="character" w:customStyle="1" w:styleId="Ttulo5Car">
-    <w:name w:val="Título 5 Car"/>
-    <w:basedOn w:val="Fuentedeprrafopredeter"/>
-    <w:link w:val="Ttulo5"/>
-    <w:uiPriority w:val="9"/>
-    <w:semiHidden/>
-    <w:rsid w:val="005358E0"/>
-    <w:rPr>
-      <w:rFonts w:eastAsiaTheme="majorEastAsia" w:cstheme="majorBidi"/>
-      <w:color w:val="0F4761" w:themeColor="accent1" w:themeShade="BF"/>
-    </w:rPr>
-  </w:style>
-  <w:style w:type="character" w:customStyle="1" w:styleId="Ttulo6Car">
-    <w:name w:val="Título 6 Car"/>
-    <w:basedOn w:val="Fuentedeprrafopredeter"/>
-    <w:link w:val="Ttulo6"/>
-    <w:uiPriority w:val="9"/>
-    <w:semiHidden/>
-    <w:rsid w:val="005358E0"/>
-    <w:rPr>
-      <w:rFonts w:eastAsiaTheme="majorEastAsia" w:cstheme="majorBidi"/>
-      <w:i/>
-      <w:iCs/>
-      <w:color w:val="595959" w:themeColor="text1" w:themeTint="A6"/>
-    </w:rPr>
-  </w:style>
-  <w:style w:type="character" w:customStyle="1" w:styleId="Ttulo7Car">
-    <w:name w:val="Título 7 Car"/>
-    <w:basedOn w:val="Fuentedeprrafopredeter"/>
-    <w:link w:val="Ttulo7"/>
-    <w:uiPriority w:val="9"/>
-    <w:semiHidden/>
-    <w:rsid w:val="005358E0"/>
-    <w:rPr>
-      <w:rFonts w:eastAsiaTheme="majorEastAsia" w:cstheme="majorBidi"/>
-      <w:color w:val="595959" w:themeColor="text1" w:themeTint="A6"/>
-    </w:rPr>
-  </w:style>
-  <w:style w:type="character" w:customStyle="1" w:styleId="Ttulo8Car">
-    <w:name w:val="Título 8 Car"/>
-    <w:basedOn w:val="Fuentedeprrafopredeter"/>
-    <w:link w:val="Ttulo8"/>
-    <w:uiPriority w:val="9"/>
-    <w:semiHidden/>
-    <w:rsid w:val="005358E0"/>
-    <w:rPr>
-      <w:rFonts w:eastAsiaTheme="majorEastAsia" w:cstheme="majorBidi"/>
-      <w:i/>
-      <w:iCs/>
-      <w:color w:val="272727" w:themeColor="text1" w:themeTint="D8"/>
-    </w:rPr>
-  </w:style>
-  <w:style w:type="character" w:customStyle="1" w:styleId="Ttulo9Car">
-    <w:name w:val="Título 9 Car"/>
-    <w:basedOn w:val="Fuentedeprrafopredeter"/>
-    <w:link w:val="Ttulo9"/>
-    <w:uiPriority w:val="9"/>
-    <w:semiHidden/>
-    <w:rsid w:val="005358E0"/>
-    <w:rPr>
-      <w:rFonts w:eastAsiaTheme="majorEastAsia" w:cstheme="majorBidi"/>
-      <w:color w:val="272727" w:themeColor="text1" w:themeTint="D8"/>
-    </w:rPr>
-  </w:style>
-  <w:style w:type="paragraph" w:styleId="Ttulo">
-    <w:name w:val="Title"/>
-    <w:basedOn w:val="Normal"/>
-    <w:next w:val="Normal"/>
-    <w:link w:val="TtuloCar"/>
-    <w:uiPriority w:val="10"/>
-    <w:qFormat/>
-    <w:rsid w:val="005358E0"/>
-    <w:pPr>
-      <w:spacing w:after="80"/>
-      <w:contextualSpacing/>
-    </w:pPr>
-    <w:rPr>
-      <w:rFonts w:asciiTheme="majorHAnsi" w:eastAsiaTheme="majorEastAsia" w:hAnsiTheme="majorHAnsi" w:cstheme="majorBidi"/>
-      <w:spacing w:val="-10"/>
-      <w:kern w:val="28"/>
-      <w:sz w:val="56"/>
-      <w:szCs w:val="56"/>
-      <w14:ligatures w14:val="standardContextual"/>
-    </w:rPr>
-  </w:style>
-  <w:style w:type="character" w:customStyle="1" w:styleId="TtuloCar">
-    <w:name w:val="Título Car"/>
-    <w:basedOn w:val="Fuentedeprrafopredeter"/>
-    <w:link w:val="Ttulo"/>
-    <w:uiPriority w:val="10"/>
-    <w:rsid w:val="005358E0"/>
-    <w:rPr>
-      <w:rFonts w:asciiTheme="majorHAnsi" w:eastAsiaTheme="majorEastAsia" w:hAnsiTheme="majorHAnsi" w:cstheme="majorBidi"/>
-      <w:spacing w:val="-10"/>
-      <w:kern w:val="28"/>
-      <w:sz w:val="56"/>
-      <w:szCs w:val="56"/>
-    </w:rPr>
-  </w:style>
-  <w:style w:type="paragraph" w:styleId="Subttulo">
-    <w:name w:val="Subtitle"/>
-    <w:basedOn w:val="Normal"/>
-    <w:next w:val="Normal"/>
-    <w:link w:val="SubttuloCar"/>
-    <w:uiPriority w:val="11"/>
-    <w:qFormat/>
-    <w:rsid w:val="005358E0"/>
-    <w:pPr>
-      <w:numPr>
-        <w:ilvl w:val="1"/>
-      </w:numPr>
-      <w:spacing w:after="160" w:line="259" w:lineRule="auto"/>
-    </w:pPr>
-    <w:rPr>
-      <w:rFonts w:eastAsiaTheme="majorEastAsia" w:cstheme="majorBidi"/>
-      <w:color w:val="595959" w:themeColor="text1" w:themeTint="A6"/>
-      <w:spacing w:val="15"/>
-      <w:kern w:val="2"/>
-      <w:sz w:val="28"/>
-      <w:szCs w:val="28"/>
-      <w14:ligatures w14:val="standardContextual"/>
-    </w:rPr>
-  </w:style>
-  <w:style w:type="character" w:customStyle="1" w:styleId="SubttuloCar">
-    <w:name w:val="Subtítulo Car"/>
-    <w:basedOn w:val="Fuentedeprrafopredeter"/>
-    <w:link w:val="Subttulo"/>
-    <w:uiPriority w:val="11"/>
-    <w:rsid w:val="005358E0"/>
-    <w:rPr>
-      <w:rFonts w:eastAsiaTheme="majorEastAsia" w:cstheme="majorBidi"/>
-      <w:color w:val="595959" w:themeColor="text1" w:themeTint="A6"/>
-      <w:spacing w:val="15"/>
-      <w:sz w:val="28"/>
-      <w:szCs w:val="28"/>
-    </w:rPr>
-  </w:style>
-  <w:style w:type="paragraph" w:styleId="Cita">
-    <w:name w:val="Quote"/>
-    <w:basedOn w:val="Normal"/>
-    <w:next w:val="Normal"/>
-    <w:link w:val="CitaCar"/>
-    <w:uiPriority w:val="29"/>
-    <w:qFormat/>
-    <w:rsid w:val="005358E0"/>
-    <w:pPr>
-      <w:spacing w:before="160" w:after="160" w:line="259" w:lineRule="auto"/>
-      <w:jc w:val="center"/>
-    </w:pPr>
-    <w:rPr>
-      <w:i/>
-      <w:iCs/>
-      <w:color w:val="404040" w:themeColor="text1" w:themeTint="BF"/>
-      <w:kern w:val="2"/>
-      <w14:ligatures w14:val="standardContextual"/>
-    </w:rPr>
-  </w:style>
-  <w:style w:type="character" w:customStyle="1" w:styleId="CitaCar">
-    <w:name w:val="Cita Car"/>
-    <w:basedOn w:val="Fuentedeprrafopredeter"/>
-    <w:link w:val="Cita"/>
-    <w:uiPriority w:val="29"/>
-    <w:rsid w:val="005358E0"/>
-    <w:rPr>
-      <w:i/>
-      <w:iCs/>
-      <w:color w:val="404040" w:themeColor="text1" w:themeTint="BF"/>
-    </w:rPr>
-  </w:style>
-  <w:style w:type="paragraph" w:styleId="Prrafodelista">
-    <w:name w:val="List Paragraph"/>
-    <w:basedOn w:val="Normal"/>
-    <w:uiPriority w:val="34"/>
-    <w:qFormat/>
-    <w:rsid w:val="005358E0"/>
-    <w:pPr>
-      <w:spacing w:after="160" w:line="259" w:lineRule="auto"/>
-      <w:ind w:left="720"/>
-      <w:contextualSpacing/>
-    </w:pPr>
-    <w:rPr>
-      <w:kern w:val="2"/>
-      <w14:ligatures w14:val="standardContextual"/>
-    </w:rPr>
-  </w:style>
-  <w:style w:type="character" w:styleId="nfasisintenso">
-    <w:name w:val="Intense Emphasis"/>
-    <w:basedOn w:val="Fuentedeprrafopredeter"/>
-    <w:uiPriority w:val="21"/>
-    <w:qFormat/>
-    <w:rsid w:val="005358E0"/>
-    <w:rPr>
-      <w:i/>
-      <w:iCs/>
-      <w:color w:val="0F4761" w:themeColor="accent1" w:themeShade="BF"/>
-    </w:rPr>
-  </w:style>
-  <w:style w:type="paragraph" w:styleId="Citadestacada">
-    <w:name w:val="Intense Quote"/>
-    <w:basedOn w:val="Normal"/>
-    <w:next w:val="Normal"/>
-    <w:link w:val="CitadestacadaCar"/>
-    <w:uiPriority w:val="30"/>
-    <w:qFormat/>
-    <w:rsid w:val="005358E0"/>
-    <w:pPr>
-      <w:pBdr>
-        <w:top w:val="single" w:sz="4" w:space="10" w:color="0F4761" w:themeColor="accent1" w:themeShade="BF"/>
-        <w:bottom w:val="single" w:sz="4" w:space="10" w:color="0F4761" w:themeColor="accent1" w:themeShade="BF"/>
-      </w:pBdr>
-      <w:spacing w:before="360" w:after="360" w:line="259" w:lineRule="auto"/>
-      <w:ind w:left="864" w:right="864"/>
-      <w:jc w:val="center"/>
-    </w:pPr>
-    <w:rPr>
-      <w:i/>
-      <w:iCs/>
-      <w:color w:val="0F4761" w:themeColor="accent1" w:themeShade="BF"/>
-      <w:kern w:val="2"/>
-      <w14:ligatures w14:val="standardContextual"/>
-    </w:rPr>
-  </w:style>
-  <w:style w:type="character" w:customStyle="1" w:styleId="CitadestacadaCar">
-    <w:name w:val="Cita destacada Car"/>
-    <w:basedOn w:val="Fuentedeprrafopredeter"/>
-    <w:link w:val="Citadestacada"/>
-    <w:uiPriority w:val="30"/>
-    <w:rsid w:val="005358E0"/>
-    <w:rPr>
-      <w:i/>
-      <w:iCs/>
-      <w:color w:val="0F4761" w:themeColor="accent1" w:themeShade="BF"/>
-    </w:rPr>
-  </w:style>
-  <w:style w:type="character" w:styleId="Referenciaintensa">
-    <w:name w:val="Intense Reference"/>
-    <w:basedOn w:val="Fuentedeprrafopredeter"/>
-    <w:uiPriority w:val="32"/>
-    <w:qFormat/>
-    <w:rsid w:val="005358E0"/>
-    <w:rPr>
-      <w:b/>
-      <w:bCs/>
-      <w:smallCaps/>
-      <w:color w:val="0F4761" w:themeColor="accent1" w:themeShade="BF"/>
-      <w:spacing w:val="5"/>
-    </w:rPr>
-  </w:style>
   <w:style w:type="table" w:styleId="Tablaconcuadrcula">
     <w:name w:val="Table Grid"/>
     <w:basedOn w:val="Tablanormal"/>
     <w:uiPriority w:val="39"/>
-    <w:rsid w:val="005358E0"/>
+    <w:rsid w:val="005358e0"/>
     <w:pPr>
       <w:spacing w:after="0" w:line="240" w:lineRule="auto"/>
     </w:pPr>
-    <w:rPr>
-      <w:kern w:val="0"/>
-      <w14:ligatures w14:val="none"/>
-    </w:rPr>
     <w:tblPr>
       <w:tblBorders>
-        <w:top w:val="single" w:sz="4" w:space="0" w:color="auto"/>
-        <w:left w:val="single" w:sz="4" w:space="0" w:color="auto"/>
-        <w:bottom w:val="single" w:sz="4" w:space="0" w:color="auto"/>
-        <w:right w:val="single" w:sz="4" w:space="0" w:color="auto"/>
-        <w:insideH w:val="single" w:sz="4" w:space="0" w:color="auto"/>
-        <w:insideV w:val="single" w:sz="4" w:space="0" w:color="auto"/>
+        <w:top w:val="single" w:color="auto" w:sz="4" w:space="0"/>
+        <w:left w:val="single" w:color="auto" w:sz="4" w:space="0"/>
+        <w:bottom w:val="single" w:color="auto" w:sz="4" w:space="0"/>
+        <w:right w:val="single" w:color="auto" w:sz="4" w:space="0"/>
+        <w:insideH w:val="single" w:color="auto" w:sz="4" w:space="0"/>
+        <w:insideV w:val="single" w:color="auto" w:sz="4" w:space="0"/>
       </w:tblBorders>
     </w:tblPr>
-  </w:style>
-  <w:style w:type="paragraph" w:styleId="Encabezado">
-    <w:name w:val="header"/>
-    <w:basedOn w:val="Normal"/>
-    <w:link w:val="EncabezadoCar"/>
-    <w:uiPriority w:val="99"/>
-    <w:unhideWhenUsed/>
-    <w:rsid w:val="005358E0"/>
-    <w:pPr>
-      <w:tabs>
-        <w:tab w:val="center" w:pos="4419"/>
-        <w:tab w:val="right" w:pos="8838"/>
-      </w:tabs>
-    </w:pPr>
-  </w:style>
-  <w:style w:type="character" w:customStyle="1" w:styleId="EncabezadoCar">
-    <w:name w:val="Encabezado Car"/>
-    <w:basedOn w:val="Fuentedeprrafopredeter"/>
-    <w:link w:val="Encabezado"/>
-    <w:uiPriority w:val="99"/>
-    <w:rsid w:val="005358E0"/>
-    <w:rPr>
-      <w:kern w:val="0"/>
-      <w14:ligatures w14:val="none"/>
-    </w:rPr>
-  </w:style>
-  <w:style w:type="paragraph" w:styleId="Piedepgina">
-    <w:name w:val="footer"/>
-    <w:basedOn w:val="Normal"/>
-    <w:link w:val="PiedepginaCar"/>
-    <w:uiPriority w:val="99"/>
-    <w:unhideWhenUsed/>
-    <w:rsid w:val="005358E0"/>
-    <w:pPr>
-      <w:tabs>
-        <w:tab w:val="center" w:pos="4419"/>
-        <w:tab w:val="right" w:pos="8838"/>
-      </w:tabs>
-    </w:pPr>
-  </w:style>
-  <w:style w:type="character" w:customStyle="1" w:styleId="PiedepginaCar">
-    <w:name w:val="Pie de página Car"/>
-    <w:basedOn w:val="Fuentedeprrafopredeter"/>
-    <w:link w:val="Piedepgina"/>
-    <w:uiPriority w:val="99"/>
-    <w:rsid w:val="005358E0"/>
-    <w:rPr>
-      <w:kern w:val="0"/>
-      <w14:ligatures w14:val="none"/>
-    </w:rPr>
   </w:style>
 </w:styles>
 </file>

</xml_diff>